<commit_message>
Changes to Word and WhatsApp reports
</commit_message>
<xml_diff>
--- a/TIMBRADO_JERO_template.docx
+++ b/TIMBRADO_JERO_template.docx
@@ -207,6 +207,7 @@
               <w:rPr>
                 <w:b/>
                 <w:bCs/>
+                <w:color w:val="1F497D" w:themeColor="text2"/>
                 <w:spacing w:val="-4"/>
                 <w:lang w:val="pt-BR"/>
               </w:rPr>
@@ -217,6 +218,7 @@
               <w:rPr>
                 <w:b/>
                 <w:bCs/>
+                <w:color w:val="1F497D" w:themeColor="text2"/>
                 <w:spacing w:val="-4"/>
                 <w:lang w:val="pt-BR"/>
               </w:rPr>
@@ -227,6 +229,7 @@
               <w:rPr>
                 <w:b/>
                 <w:bCs/>
+                <w:color w:val="1F497D" w:themeColor="text2"/>
                 <w:spacing w:val="-4"/>
                 <w:lang w:val="pt-BR"/>
               </w:rPr>
@@ -282,6 +285,7 @@
               <w:rPr>
                 <w:b/>
                 <w:bCs/>
+                <w:color w:val="00B050"/>
                 <w:spacing w:val="-4"/>
                 <w:lang w:val="pt-BR"/>
               </w:rPr>
@@ -435,6 +439,7 @@
               <w:rPr>
                 <w:b/>
                 <w:bCs/>
+                <w:color w:val="C00000"/>
                 <w:spacing w:val="-4"/>
                 <w:lang w:val="pt-BR"/>
               </w:rPr>
@@ -445,6 +450,7 @@
               <w:rPr>
                 <w:b/>
                 <w:bCs/>
+                <w:color w:val="C00000"/>
                 <w:spacing w:val="-4"/>
                 <w:lang w:val="pt-BR"/>
               </w:rPr>
@@ -455,6 +461,7 @@
               <w:rPr>
                 <w:b/>
                 <w:bCs/>
+                <w:color w:val="C00000"/>
                 <w:spacing w:val="-4"/>
                 <w:lang w:val="pt-BR"/>
               </w:rPr>
@@ -472,34 +479,19 @@
         </w:tabs>
         <w:spacing w:before="188" w:line="360" w:lineRule="auto"/>
         <w:rPr>
+          <w:spacing w:val="-4"/>
+          <w:lang w:val="pt-BR"/>
+        </w:rPr>
+      </w:pPr>
+      <w:r>
+        <w:rPr>
           <w:b/>
           <w:bCs/>
           <w:spacing w:val="-4"/>
           <w:lang w:val="pt-BR"/>
         </w:rPr>
-      </w:pPr>
-      <w:r>
-        <w:rPr>
-          <w:b/>
-          <w:bCs/>
-          <w:spacing w:val="-4"/>
-          <w:lang w:val="pt-BR"/>
-        </w:rPr>
-        <w:t>DESTAQUES – MAIORES INVESTIMENTOS</w:t>
-      </w:r>
-    </w:p>
-    <w:p>
-      <w:pPr>
-        <w:pStyle w:val="Corpodetexto"/>
-        <w:tabs>
-          <w:tab w:val="left" w:pos="1714"/>
-        </w:tabs>
-        <w:spacing w:before="188" w:line="360" w:lineRule="auto"/>
-        <w:rPr>
-          <w:spacing w:val="-4"/>
-          <w:lang w:val="pt-BR"/>
-        </w:rPr>
-      </w:pPr>
+        <w:t xml:space="preserve">**DESTAQUES – INVESTIMENTOS ATENDIDOS** </w:t>
+      </w:r>
       <w:r>
         <w:rPr>
           <w:spacing w:val="-4"/>
@@ -542,18 +534,32 @@
           <w:lang w:val="pt-BR"/>
         </w:rPr>
       </w:pPr>
-      <w:r>
-        <w:rPr>
-          <w:spacing w:val="-4"/>
-          <w:lang w:val="pt-BR"/>
-        </w:rPr>
-        <w:t>{</w:t>
+    </w:p>
+    <w:p>
+      <w:pPr>
+        <w:pStyle w:val="Corpodetexto"/>
+        <w:tabs>
+          <w:tab w:val="left" w:pos="1714"/>
+        </w:tabs>
+        <w:spacing w:before="188" w:line="360" w:lineRule="auto"/>
+        <w:rPr>
+          <w:color w:val="1F497D" w:themeColor="text2"/>
+          <w:spacing w:val="-4"/>
+          <w:lang w:val="pt-BR"/>
+        </w:rPr>
+      </w:pPr>
+      <w:r>
+        <w:rPr>
+          <w:color w:val="1F497D" w:themeColor="text2"/>
+          <w:spacing w:val="-4"/>
+          <w:lang w:val="pt-BR"/>
+        </w:rPr>
+        <w:t>**{</w:t>
       </w:r>
       <w:proofErr w:type="spellStart"/>
       <w:r>
         <w:rPr>
-          <w:b/>
-          <w:bCs/>
+          <w:color w:val="1F497D" w:themeColor="text2"/>
           <w:spacing w:val="-4"/>
           <w:lang w:val="pt-BR"/>
         </w:rPr>
@@ -562,6 +568,101 @@
       <w:proofErr w:type="spellEnd"/>
       <w:r>
         <w:rPr>
+          <w:color w:val="1F497D" w:themeColor="text2"/>
+          <w:spacing w:val="-4"/>
+          <w:lang w:val="pt-BR"/>
+        </w:rPr>
+        <w:t>} — {</w:t>
+      </w:r>
+      <w:proofErr w:type="spellStart"/>
+      <w:r>
+        <w:rPr>
+          <w:color w:val="1F497D" w:themeColor="text2"/>
+          <w:spacing w:val="-4"/>
+          <w:lang w:val="pt-BR"/>
+        </w:rPr>
+        <w:t>totalItens</w:t>
+      </w:r>
+      <w:proofErr w:type="spellEnd"/>
+      <w:r>
+        <w:rPr>
+          <w:color w:val="1F497D" w:themeColor="text2"/>
+          <w:spacing w:val="-4"/>
+          <w:lang w:val="pt-BR"/>
+        </w:rPr>
+        <w:t>} ITENS**</w:t>
+      </w:r>
+    </w:p>
+    <w:p>
+      <w:pPr>
+        <w:pStyle w:val="Corpodetexto"/>
+        <w:tabs>
+          <w:tab w:val="left" w:pos="1714"/>
+        </w:tabs>
+        <w:spacing w:before="188" w:line="360" w:lineRule="auto"/>
+        <w:rPr>
+          <w:spacing w:val="-4"/>
+          <w:lang w:val="pt-BR"/>
+        </w:rPr>
+      </w:pPr>
+      <w:r>
+        <w:rPr>
+          <w:spacing w:val="-4"/>
+          <w:lang w:val="pt-BR"/>
+        </w:rPr>
+        <w:br/>
+      </w:r>
+      <w:r>
+        <w:rPr>
+          <w:spacing w:val="-4"/>
+          <w:lang w:val="pt-BR"/>
+        </w:rPr>
+        <w:t>{#itens}</w:t>
+      </w:r>
+    </w:p>
+    <w:p>
+      <w:pPr>
+        <w:pStyle w:val="Corpodetexto"/>
+        <w:tabs>
+          <w:tab w:val="left" w:pos="1714"/>
+        </w:tabs>
+        <w:spacing w:before="188" w:line="360" w:lineRule="auto"/>
+        <w:rPr>
+          <w:spacing w:val="-4"/>
+          <w:lang w:val="pt-BR"/>
+        </w:rPr>
+      </w:pPr>
+    </w:p>
+    <w:p>
+      <w:pPr>
+        <w:pStyle w:val="Corpodetexto"/>
+        <w:tabs>
+          <w:tab w:val="left" w:pos="1714"/>
+        </w:tabs>
+        <w:spacing w:before="188" w:line="360" w:lineRule="auto"/>
+        <w:rPr>
+          <w:spacing w:val="-4"/>
+          <w:lang w:val="pt-BR"/>
+        </w:rPr>
+      </w:pPr>
+      <w:r>
+        <w:rPr>
+          <w:spacing w:val="-4"/>
+          <w:lang w:val="pt-BR"/>
+        </w:rPr>
+        <w:t>{valor} - {</w:t>
+      </w:r>
+      <w:proofErr w:type="spellStart"/>
+      <w:r>
+        <w:rPr>
+          <w:spacing w:val="-4"/>
+          <w:lang w:val="pt-BR"/>
+        </w:rPr>
+        <w:t>desc</w:t>
+      </w:r>
+      <w:proofErr w:type="spellEnd"/>
+      <w:r>
+        <w:rPr>
           <w:spacing w:val="-4"/>
           <w:lang w:val="pt-BR"/>
         </w:rPr>
@@ -580,29 +681,92 @@
           <w:lang w:val="pt-BR"/>
         </w:rPr>
       </w:pPr>
-      <w:r>
-        <w:rPr>
-          <w:spacing w:val="-4"/>
-          <w:lang w:val="pt-BR"/>
-        </w:rPr>
-        <w:t>{valor} - {</w:t>
+    </w:p>
+    <w:p>
+      <w:pPr>
+        <w:pStyle w:val="Corpodetexto"/>
+        <w:tabs>
+          <w:tab w:val="left" w:pos="1714"/>
+        </w:tabs>
+        <w:spacing w:before="188" w:line="360" w:lineRule="auto"/>
+        <w:rPr>
+          <w:spacing w:val="-4"/>
+          <w:lang w:val="pt-BR"/>
+        </w:rPr>
+      </w:pPr>
+      <w:r>
+        <w:rPr>
+          <w:spacing w:val="-4"/>
+          <w:lang w:val="pt-BR"/>
+        </w:rPr>
+        <w:t>{/itens}</w:t>
+      </w:r>
+    </w:p>
+    <w:p>
+      <w:pPr>
+        <w:pStyle w:val="Corpodetexto"/>
+        <w:tabs>
+          <w:tab w:val="left" w:pos="1714"/>
+        </w:tabs>
+        <w:spacing w:before="188" w:line="360" w:lineRule="auto"/>
+        <w:rPr>
+          <w:spacing w:val="-4"/>
+          <w:lang w:val="pt-BR"/>
+        </w:rPr>
+      </w:pPr>
+    </w:p>
+    <w:p>
+      <w:pPr>
+        <w:pStyle w:val="Corpodetexto"/>
+        <w:tabs>
+          <w:tab w:val="left" w:pos="1714"/>
+        </w:tabs>
+        <w:spacing w:before="188" w:line="360" w:lineRule="auto"/>
+        <w:rPr>
+          <w:color w:val="1F497D" w:themeColor="text2"/>
+          <w:spacing w:val="-4"/>
+          <w:lang w:val="pt-BR"/>
+        </w:rPr>
+      </w:pPr>
+      <w:r>
+        <w:rPr>
+          <w:color w:val="1F497D" w:themeColor="text2"/>
+          <w:spacing w:val="-4"/>
+          <w:lang w:val="pt-BR"/>
+        </w:rPr>
+        <w:t>**Total {</w:t>
       </w:r>
       <w:proofErr w:type="spellStart"/>
       <w:r>
         <w:rPr>
-          <w:spacing w:val="-4"/>
-          <w:lang w:val="pt-BR"/>
-        </w:rPr>
-        <w:t>desc</w:t>
+          <w:color w:val="1F497D" w:themeColor="text2"/>
+          <w:spacing w:val="-4"/>
+          <w:lang w:val="pt-BR"/>
+        </w:rPr>
+        <w:t>organ</w:t>
       </w:r>
       <w:proofErr w:type="spellEnd"/>
       <w:r>
         <w:rPr>
-          <w:spacing w:val="-4"/>
-          <w:lang w:val="pt-BR"/>
-        </w:rPr>
-        <w:t>}</w:t>
-      </w:r>
+          <w:color w:val="1F497D" w:themeColor="text2"/>
+          <w:spacing w:val="-4"/>
+          <w:lang w:val="pt-BR"/>
+        </w:rPr>
+        <w:t>}: {total}**</w:t>
+      </w:r>
+    </w:p>
+    <w:p>
+      <w:pPr>
+        <w:pStyle w:val="Corpodetexto"/>
+        <w:tabs>
+          <w:tab w:val="left" w:pos="1714"/>
+        </w:tabs>
+        <w:spacing w:before="188" w:line="360" w:lineRule="auto"/>
+        <w:rPr>
+          <w:spacing w:val="-4"/>
+          <w:lang w:val="pt-BR"/>
+        </w:rPr>
+      </w:pPr>
     </w:p>
     <w:p>
       <w:pPr>
@@ -649,14 +813,7 @@
           <w:lang w:val="pt-BR"/>
         </w:rPr>
       </w:pPr>
-    </w:p>
-    <w:p>
-      <w:pPr>
-        <w:pStyle w:val="Corpodetexto"/>
-        <w:tabs>
-          <w:tab w:val="left" w:pos="1714"/>
-        </w:tabs>
-        <w:spacing w:before="188" w:line="360" w:lineRule="auto"/>
+      <w:r>
         <w:rPr>
           <w:b/>
           <w:bCs/>
@@ -664,30 +821,8 @@
           <w:spacing w:val="-4"/>
           <w:lang w:val="pt-BR"/>
         </w:rPr>
-      </w:pPr>
-      <w:r>
-        <w:rPr>
-          <w:b/>
-          <w:bCs/>
-          <w:color w:val="EE0000"/>
-          <w:spacing w:val="-4"/>
-          <w:lang w:val="pt-BR"/>
-        </w:rPr>
-        <w:t>PLEITOS EM ABERTO</w:t>
-      </w:r>
-    </w:p>
-    <w:p>
-      <w:pPr>
-        <w:pStyle w:val="Corpodetexto"/>
-        <w:tabs>
-          <w:tab w:val="left" w:pos="1714"/>
-        </w:tabs>
-        <w:spacing w:before="188" w:line="360" w:lineRule="auto"/>
-        <w:rPr>
-          <w:spacing w:val="-4"/>
-          <w:lang w:val="pt-BR"/>
-        </w:rPr>
-      </w:pPr>
+        <w:t xml:space="preserve">**PLEITOS EM ABERTO** </w:t>
+      </w:r>
       <w:r>
         <w:rPr>
           <w:spacing w:val="-4"/>
@@ -715,7 +850,6 @@
           <w:spacing w:val="-4"/>
           <w:lang w:val="pt-BR"/>
         </w:rPr>
-        <w:lastRenderedPageBreak/>
         <w:t>{#abertos}</w:t>
       </w:r>
     </w:p>
@@ -727,28 +861,26 @@
         </w:tabs>
         <w:spacing w:before="188" w:line="360" w:lineRule="auto"/>
         <w:rPr>
-          <w:spacing w:val="-4"/>
-          <w:lang w:val="pt-BR"/>
-        </w:rPr>
-      </w:pPr>
-      <w:r>
-        <w:rPr>
           <w:rFonts w:ascii="Segoe UI Emoji" w:hAnsi="Segoe UI Emoji" w:cs="Segoe UI Emoji"/>
-          <w:spacing w:val="-4"/>
-          <w:lang w:val="pt-BR"/>
-        </w:rPr>
-        <w:t>🏷️</w:t>
-      </w:r>
-      <w:r>
-        <w:rPr>
-          <w:spacing w:val="-4"/>
-          <w:lang w:val="pt-BR"/>
-        </w:rPr>
-        <w:t xml:space="preserve"> {</w:t>
+          <w:color w:val="1F497D" w:themeColor="text2"/>
+          <w:spacing w:val="-4"/>
+          <w:lang w:val="pt-BR"/>
+        </w:rPr>
+      </w:pPr>
+      <w:r>
+        <w:rPr>
+          <w:rFonts w:ascii="Segoe UI Emoji" w:hAnsi="Segoe UI Emoji" w:cs="Segoe UI Emoji"/>
+          <w:color w:val="1F497D" w:themeColor="text2"/>
+          <w:spacing w:val="-4"/>
+          <w:lang w:val="pt-BR"/>
+        </w:rPr>
+        <w:t>**• {</w:t>
       </w:r>
       <w:proofErr w:type="spellStart"/>
       <w:r>
         <w:rPr>
+          <w:rFonts w:ascii="Segoe UI Emoji" w:hAnsi="Segoe UI Emoji" w:cs="Segoe UI Emoji"/>
+          <w:color w:val="1F497D" w:themeColor="text2"/>
           <w:spacing w:val="-4"/>
           <w:lang w:val="pt-BR"/>
         </w:rPr>
@@ -757,6 +889,115 @@
       <w:proofErr w:type="spellEnd"/>
       <w:r>
         <w:rPr>
+          <w:rFonts w:ascii="Segoe UI Emoji" w:hAnsi="Segoe UI Emoji" w:cs="Segoe UI Emoji"/>
+          <w:color w:val="1F497D" w:themeColor="text2"/>
+          <w:spacing w:val="-4"/>
+          <w:lang w:val="pt-BR"/>
+        </w:rPr>
+        <w:t>} — {</w:t>
+      </w:r>
+      <w:proofErr w:type="spellStart"/>
+      <w:r>
+        <w:rPr>
+          <w:rFonts w:ascii="Segoe UI Emoji" w:hAnsi="Segoe UI Emoji" w:cs="Segoe UI Emoji"/>
+          <w:color w:val="1F497D" w:themeColor="text2"/>
+          <w:spacing w:val="-4"/>
+          <w:lang w:val="pt-BR"/>
+        </w:rPr>
+        <w:t>totalItens</w:t>
+      </w:r>
+      <w:proofErr w:type="spellEnd"/>
+      <w:r>
+        <w:rPr>
+          <w:rFonts w:ascii="Segoe UI Emoji" w:hAnsi="Segoe UI Emoji" w:cs="Segoe UI Emoji"/>
+          <w:color w:val="1F497D" w:themeColor="text2"/>
+          <w:spacing w:val="-4"/>
+          <w:lang w:val="pt-BR"/>
+        </w:rPr>
+        <w:t>} ITENS**</w:t>
+      </w:r>
+    </w:p>
+    <w:p>
+      <w:pPr>
+        <w:pStyle w:val="Corpodetexto"/>
+        <w:tabs>
+          <w:tab w:val="left" w:pos="1714"/>
+        </w:tabs>
+        <w:spacing w:before="188" w:line="360" w:lineRule="auto"/>
+        <w:rPr>
+          <w:rFonts w:ascii="Segoe UI Emoji" w:hAnsi="Segoe UI Emoji" w:cs="Segoe UI Emoji"/>
+          <w:spacing w:val="-4"/>
+          <w:lang w:val="pt-BR"/>
+        </w:rPr>
+      </w:pPr>
+    </w:p>
+    <w:p>
+      <w:pPr>
+        <w:pStyle w:val="Corpodetexto"/>
+        <w:tabs>
+          <w:tab w:val="left" w:pos="1714"/>
+        </w:tabs>
+        <w:spacing w:before="188" w:line="360" w:lineRule="auto"/>
+        <w:rPr>
+          <w:spacing w:val="-4"/>
+          <w:lang w:val="pt-BR"/>
+        </w:rPr>
+      </w:pPr>
+      <w:r>
+        <w:rPr>
+          <w:spacing w:val="-4"/>
+          <w:lang w:val="pt-BR"/>
+        </w:rPr>
+        <w:t>{#itens}</w:t>
+      </w:r>
+    </w:p>
+    <w:p>
+      <w:pPr>
+        <w:pStyle w:val="Corpodetexto"/>
+        <w:tabs>
+          <w:tab w:val="left" w:pos="1714"/>
+        </w:tabs>
+        <w:spacing w:before="188" w:line="360" w:lineRule="auto"/>
+        <w:rPr>
+          <w:spacing w:val="-4"/>
+          <w:lang w:val="pt-BR"/>
+        </w:rPr>
+      </w:pPr>
+    </w:p>
+    <w:p>
+      <w:pPr>
+        <w:pStyle w:val="Corpodetexto"/>
+        <w:tabs>
+          <w:tab w:val="left" w:pos="1714"/>
+        </w:tabs>
+        <w:spacing w:before="188" w:line="360" w:lineRule="auto"/>
+        <w:rPr>
+          <w:rFonts w:ascii="Segoe UI Emoji" w:hAnsi="Segoe UI Emoji" w:cs="Segoe UI Emoji"/>
+          <w:spacing w:val="-4"/>
+          <w:lang w:val="pt-BR"/>
+        </w:rPr>
+      </w:pPr>
+      <w:r>
+        <w:rPr>
+          <w:rFonts w:ascii="Segoe UI Emoji" w:hAnsi="Segoe UI Emoji" w:cs="Segoe UI Emoji"/>
+          <w:spacing w:val="-4"/>
+          <w:lang w:val="pt-BR"/>
+        </w:rPr>
+        <w:t>• {</w:t>
+      </w:r>
+      <w:proofErr w:type="spellStart"/>
+      <w:r>
+        <w:rPr>
+          <w:rFonts w:ascii="Segoe UI Emoji" w:hAnsi="Segoe UI Emoji" w:cs="Segoe UI Emoji"/>
+          <w:spacing w:val="-4"/>
+          <w:lang w:val="pt-BR"/>
+        </w:rPr>
+        <w:t>descricao</w:t>
+      </w:r>
+      <w:proofErr w:type="spellEnd"/>
+      <w:r>
+        <w:rPr>
+          <w:rFonts w:ascii="Segoe UI Emoji" w:hAnsi="Segoe UI Emoji" w:cs="Segoe UI Emoji"/>
           <w:spacing w:val="-4"/>
           <w:lang w:val="pt-BR"/>
         </w:rPr>
@@ -771,81 +1012,97 @@
         </w:tabs>
         <w:spacing w:before="188" w:line="360" w:lineRule="auto"/>
         <w:rPr>
-          <w:spacing w:val="-4"/>
-          <w:lang w:val="pt-BR"/>
-        </w:rPr>
-      </w:pPr>
-      <w:r>
-        <w:rPr>
-          <w:spacing w:val="-4"/>
-          <w:lang w:val="pt-BR"/>
-        </w:rPr>
-        <w:t>{#itens}</w:t>
-      </w:r>
-    </w:p>
-    <w:p>
-      <w:pPr>
-        <w:pStyle w:val="Corpodetexto"/>
-        <w:tabs>
-          <w:tab w:val="left" w:pos="1714"/>
-        </w:tabs>
-        <w:spacing w:before="188" w:line="360" w:lineRule="auto"/>
-        <w:rPr>
-          <w:spacing w:val="-4"/>
-          <w:lang w:val="pt-BR"/>
-        </w:rPr>
-      </w:pPr>
-      <w:r>
-        <w:rPr>
           <w:rFonts w:ascii="Segoe UI Emoji" w:hAnsi="Segoe UI Emoji" w:cs="Segoe UI Emoji"/>
           <w:spacing w:val="-4"/>
           <w:lang w:val="pt-BR"/>
         </w:rPr>
-        <w:t>➡️</w:t>
-      </w:r>
-      <w:r>
-        <w:rPr>
-          <w:spacing w:val="-4"/>
-          <w:lang w:val="pt-BR"/>
-        </w:rPr>
-        <w:t xml:space="preserve"> {</w:t>
+      </w:pPr>
+    </w:p>
+    <w:p>
+      <w:pPr>
+        <w:pStyle w:val="Corpodetexto"/>
+        <w:tabs>
+          <w:tab w:val="left" w:pos="1714"/>
+        </w:tabs>
+        <w:spacing w:before="188" w:line="360" w:lineRule="auto"/>
+        <w:rPr>
+          <w:spacing w:val="-4"/>
+          <w:lang w:val="pt-BR"/>
+        </w:rPr>
+      </w:pPr>
+      <w:r>
+        <w:rPr>
+          <w:spacing w:val="-4"/>
+          <w:lang w:val="pt-BR"/>
+        </w:rPr>
+        <w:t>{/itens}</w:t>
+      </w:r>
+    </w:p>
+    <w:p>
+      <w:pPr>
+        <w:pStyle w:val="Corpodetexto"/>
+        <w:tabs>
+          <w:tab w:val="left" w:pos="1714"/>
+        </w:tabs>
+        <w:spacing w:before="188" w:line="360" w:lineRule="auto"/>
+        <w:rPr>
+          <w:spacing w:val="-4"/>
+          <w:lang w:val="pt-BR"/>
+        </w:rPr>
+      </w:pPr>
+    </w:p>
+    <w:p>
+      <w:pPr>
+        <w:pStyle w:val="Corpodetexto"/>
+        <w:tabs>
+          <w:tab w:val="left" w:pos="1714"/>
+        </w:tabs>
+        <w:spacing w:before="188" w:line="360" w:lineRule="auto"/>
+        <w:rPr>
+          <w:color w:val="1F497D" w:themeColor="text2"/>
+          <w:spacing w:val="-4"/>
+          <w:lang w:val="pt-BR"/>
+        </w:rPr>
+      </w:pPr>
+      <w:r>
+        <w:rPr>
+          <w:color w:val="1F497D" w:themeColor="text2"/>
+          <w:spacing w:val="-4"/>
+          <w:lang w:val="pt-BR"/>
+        </w:rPr>
+        <w:t>**Total {</w:t>
       </w:r>
       <w:proofErr w:type="spellStart"/>
       <w:r>
         <w:rPr>
-          <w:spacing w:val="-4"/>
-          <w:lang w:val="pt-BR"/>
-        </w:rPr>
-        <w:t>descricao</w:t>
+          <w:color w:val="1F497D" w:themeColor="text2"/>
+          <w:spacing w:val="-4"/>
+          <w:lang w:val="pt-BR"/>
+        </w:rPr>
+        <w:t>orgao</w:t>
       </w:r>
       <w:proofErr w:type="spellEnd"/>
       <w:r>
         <w:rPr>
-          <w:spacing w:val="-4"/>
-          <w:lang w:val="pt-BR"/>
-        </w:rPr>
-        <w:t>}</w:t>
-      </w:r>
-    </w:p>
-    <w:p>
-      <w:pPr>
-        <w:pStyle w:val="Corpodetexto"/>
-        <w:tabs>
-          <w:tab w:val="left" w:pos="1714"/>
-        </w:tabs>
-        <w:spacing w:before="188" w:line="360" w:lineRule="auto"/>
-        <w:rPr>
-          <w:spacing w:val="-4"/>
-          <w:lang w:val="pt-BR"/>
-        </w:rPr>
-      </w:pPr>
-      <w:r>
-        <w:rPr>
-          <w:spacing w:val="-4"/>
-          <w:lang w:val="pt-BR"/>
-        </w:rPr>
-        <w:t>{/itens}</w:t>
-      </w:r>
+          <w:color w:val="1F497D" w:themeColor="text2"/>
+          <w:spacing w:val="-4"/>
+          <w:lang w:val="pt-BR"/>
+        </w:rPr>
+        <w:t>}: {total}**</w:t>
+      </w:r>
+    </w:p>
+    <w:p>
+      <w:pPr>
+        <w:pStyle w:val="Corpodetexto"/>
+        <w:tabs>
+          <w:tab w:val="left" w:pos="1714"/>
+        </w:tabs>
+        <w:spacing w:before="188" w:line="360" w:lineRule="auto"/>
+        <w:rPr>
+          <w:spacing w:val="-4"/>
+          <w:lang w:val="pt-BR"/>
+        </w:rPr>
+      </w:pPr>
     </w:p>
     <w:p>
       <w:pPr>
@@ -881,12 +1138,12 @@
       </w:pPr>
     </w:p>
     <w:sectPr>
-      <w:headerReference w:type="even" r:id="rId6"/>
-      <w:headerReference w:type="default" r:id="rId7"/>
-      <w:footerReference w:type="even" r:id="rId8"/>
-      <w:footerReference w:type="default" r:id="rId9"/>
-      <w:headerReference w:type="first" r:id="rId10"/>
-      <w:footerReference w:type="first" r:id="rId11"/>
+      <w:headerReference w:type="even" r:id="rId7"/>
+      <w:headerReference w:type="default" r:id="rId8"/>
+      <w:footerReference w:type="even" r:id="rId9"/>
+      <w:footerReference w:type="default" r:id="rId10"/>
+      <w:headerReference w:type="first" r:id="rId11"/>
+      <w:footerReference w:type="first" r:id="rId12"/>
       <w:pgSz w:w="11909" w:h="16834"/>
       <w:pgMar w:top="1440" w:right="1440" w:bottom="1440" w:left="1440" w:header="720" w:footer="720" w:gutter="0"/>
       <w:pgNumType w:start="1"/>
@@ -1028,6 +1285,127 @@
     </w:pPr>
   </w:p>
 </w:hdr>
+</file>
+
+<file path=word/numbering.xml><?xml version="1.0" encoding="utf-8"?>
+<w:numbering xmlns:wpc="http://schemas.microsoft.com/office/word/2010/wordprocessingCanvas" xmlns:cx="http://schemas.microsoft.com/office/drawing/2014/chartex" xmlns:cx1="http://schemas.microsoft.com/office/drawing/2015/9/8/chartex" xmlns:cx2="http://schemas.microsoft.com/office/drawing/2015/10/21/chartex" xmlns:cx3="http://schemas.microsoft.com/office/drawing/2016/5/9/chartex" xmlns:cx4="http://schemas.microsoft.com/office/drawing/2016/5/10/chartex" xmlns:cx5="http://schemas.microsoft.com/office/drawing/2016/5/11/chartex" xmlns:cx6="http://schemas.microsoft.com/office/drawing/2016/5/12/chartex" xmlns:cx7="http://schemas.microsoft.com/office/drawing/2016/5/13/chartex" xmlns:cx8="http://schemas.microsoft.com/office/drawing/2016/5/14/chartex" xmlns:mc="http://schemas.openxmlformats.org/markup-compatibility/2006" xmlns:aink="http://schemas.microsoft.com/office/drawing/2016/ink" xmlns:am3d="http://schemas.microsoft.com/office/drawing/2017/model3d" xmlns:o="urn:schemas-microsoft-com:office:office" xmlns:oel="http://schemas.microsoft.com/office/2019/extlst" xmlns:r="http://schemas.openxmlformats.org/officeDocument/2006/relationships" xmlns:m="http://schemas.openxmlformats.org/officeDocument/2006/math" xmlns:v="urn:schemas-microsoft-com:vml" xmlns:wp14="http://schemas.microsoft.com/office/word/2010/wordprocessingDrawing" xmlns:wp="http://schemas.openxmlformats.org/drawingml/2006/wordprocessingDrawing" xmlns:w10="urn:schemas-microsoft-com:office:word" xmlns:w="http://schemas.openxmlformats.org/wordprocessingml/2006/main" xmlns:w14="http://schemas.microsoft.com/office/word/2010/wordml" xmlns:w15="http://schemas.microsoft.com/office/word/2012/wordml" xmlns:w16cex="http://schemas.microsoft.com/office/word/2018/wordml/cex" xmlns:w16cid="http://schemas.microsoft.com/office/word/2016/wordml/cid" xmlns:w16="http://schemas.microsoft.com/office/word/2018/wordml" xmlns:w16du="http://schemas.microsoft.com/office/word/2023/wordml/word16du" xmlns:w16sdtdh="http://schemas.microsoft.com/office/word/2020/wordml/sdtdatahash" xmlns:w16sdtfl="http://schemas.microsoft.com/office/word/2024/wordml/sdtformatlock" xmlns:w16se="http://schemas.microsoft.com/office/word/2015/wordml/symex" xmlns:wpg="http://schemas.microsoft.com/office/word/2010/wordprocessingGroup" xmlns:wpi="http://schemas.microsoft.com/office/word/2010/wordprocessingInk" xmlns:wne="http://schemas.microsoft.com/office/word/2006/wordml" xmlns:wps="http://schemas.microsoft.com/office/word/2010/wordprocessingShape" mc:Ignorable="w14 w15 w16se w16cid w16 w16cex w16sdtdh w16sdtfl w16du wp14">
+  <w:abstractNum w:abstractNumId="0" w15:restartNumberingAfterBreak="0">
+    <w:nsid w:val="1E0F5835"/>
+    <w:multiLevelType w:val="multilevel"/>
+    <w:tmpl w:val="55D666FA"/>
+    <w:lvl w:ilvl="0">
+      <w:start w:val="1"/>
+      <w:numFmt w:val="decimal"/>
+      <w:lvlText w:val="%1."/>
+      <w:lvlJc w:val="left"/>
+      <w:pPr>
+        <w:tabs>
+          <w:tab w:val="num" w:pos="720"/>
+        </w:tabs>
+        <w:ind w:left="720" w:hanging="360"/>
+      </w:pPr>
+    </w:lvl>
+    <w:lvl w:ilvl="1" w:tentative="1">
+      <w:start w:val="1"/>
+      <w:numFmt w:val="decimal"/>
+      <w:lvlText w:val="%2."/>
+      <w:lvlJc w:val="left"/>
+      <w:pPr>
+        <w:tabs>
+          <w:tab w:val="num" w:pos="1440"/>
+        </w:tabs>
+        <w:ind w:left="1440" w:hanging="360"/>
+      </w:pPr>
+    </w:lvl>
+    <w:lvl w:ilvl="2" w:tentative="1">
+      <w:start w:val="1"/>
+      <w:numFmt w:val="decimal"/>
+      <w:lvlText w:val="%3."/>
+      <w:lvlJc w:val="left"/>
+      <w:pPr>
+        <w:tabs>
+          <w:tab w:val="num" w:pos="2160"/>
+        </w:tabs>
+        <w:ind w:left="2160" w:hanging="360"/>
+      </w:pPr>
+    </w:lvl>
+    <w:lvl w:ilvl="3" w:tentative="1">
+      <w:start w:val="1"/>
+      <w:numFmt w:val="decimal"/>
+      <w:lvlText w:val="%4."/>
+      <w:lvlJc w:val="left"/>
+      <w:pPr>
+        <w:tabs>
+          <w:tab w:val="num" w:pos="2880"/>
+        </w:tabs>
+        <w:ind w:left="2880" w:hanging="360"/>
+      </w:pPr>
+    </w:lvl>
+    <w:lvl w:ilvl="4" w:tentative="1">
+      <w:start w:val="1"/>
+      <w:numFmt w:val="decimal"/>
+      <w:lvlText w:val="%5."/>
+      <w:lvlJc w:val="left"/>
+      <w:pPr>
+        <w:tabs>
+          <w:tab w:val="num" w:pos="3600"/>
+        </w:tabs>
+        <w:ind w:left="3600" w:hanging="360"/>
+      </w:pPr>
+    </w:lvl>
+    <w:lvl w:ilvl="5" w:tentative="1">
+      <w:start w:val="1"/>
+      <w:numFmt w:val="decimal"/>
+      <w:lvlText w:val="%6."/>
+      <w:lvlJc w:val="left"/>
+      <w:pPr>
+        <w:tabs>
+          <w:tab w:val="num" w:pos="4320"/>
+        </w:tabs>
+        <w:ind w:left="4320" w:hanging="360"/>
+      </w:pPr>
+    </w:lvl>
+    <w:lvl w:ilvl="6" w:tentative="1">
+      <w:start w:val="1"/>
+      <w:numFmt w:val="decimal"/>
+      <w:lvlText w:val="%7."/>
+      <w:lvlJc w:val="left"/>
+      <w:pPr>
+        <w:tabs>
+          <w:tab w:val="num" w:pos="5040"/>
+        </w:tabs>
+        <w:ind w:left="5040" w:hanging="360"/>
+      </w:pPr>
+    </w:lvl>
+    <w:lvl w:ilvl="7" w:tentative="1">
+      <w:start w:val="1"/>
+      <w:numFmt w:val="decimal"/>
+      <w:lvlText w:val="%8."/>
+      <w:lvlJc w:val="left"/>
+      <w:pPr>
+        <w:tabs>
+          <w:tab w:val="num" w:pos="5760"/>
+        </w:tabs>
+        <w:ind w:left="5760" w:hanging="360"/>
+      </w:pPr>
+    </w:lvl>
+    <w:lvl w:ilvl="8" w:tentative="1">
+      <w:start w:val="1"/>
+      <w:numFmt w:val="decimal"/>
+      <w:lvlText w:val="%9."/>
+      <w:lvlJc w:val="left"/>
+      <w:pPr>
+        <w:tabs>
+          <w:tab w:val="num" w:pos="6480"/>
+        </w:tabs>
+        <w:ind w:left="6480" w:hanging="360"/>
+      </w:pPr>
+    </w:lvl>
+  </w:abstractNum>
+  <w:num w:numId="1" w16cid:durableId="306319016">
+    <w:abstractNumId w:val="0"/>
+  </w:num>
+</w:numbering>
 </file>
 
 <file path=word/styles.xml><?xml version="1.0" encoding="utf-8"?>

</xml_diff>

<commit_message>
Latest update to code and report standardization
</commit_message>
<xml_diff>
--- a/TIMBRADO_JERO_template.docx
+++ b/TIMBRADO_JERO_template.docx
@@ -8,65 +8,45 @@
         <w:tabs>
           <w:tab w:val="left" w:pos="1714"/>
         </w:tabs>
-        <w:spacing w:before="188" w:line="360" w:lineRule="auto"/>
-        <w:rPr>
-          <w:spacing w:val="-4"/>
-          <w:lang w:val="pt-BR"/>
-        </w:rPr>
-      </w:pPr>
-      <w:r>
-        <w:rPr>
-          <w:spacing w:val="-4"/>
-          <w:lang w:val="pt-BR"/>
-        </w:rPr>
-        <w:t>Material {</w:t>
-      </w:r>
-      <w:proofErr w:type="spellStart"/>
-      <w:r>
-        <w:rPr>
-          <w:spacing w:val="-4"/>
-          <w:lang w:val="pt-BR"/>
-        </w:rPr>
-        <w:t>municipio</w:t>
-      </w:r>
-      <w:proofErr w:type="spellEnd"/>
-      <w:r>
-        <w:rPr>
-          <w:spacing w:val="-4"/>
-          <w:lang w:val="pt-BR"/>
-        </w:rPr>
-        <w:t>}</w:t>
-      </w:r>
-    </w:p>
-    <w:p>
-      <w:pPr>
-        <w:pStyle w:val="Corpodetexto"/>
-        <w:tabs>
-          <w:tab w:val="left" w:pos="1714"/>
-        </w:tabs>
-        <w:spacing w:before="188" w:line="360" w:lineRule="auto"/>
-        <w:rPr>
+        <w:spacing w:line="276" w:lineRule="auto"/>
+        <w:rPr>
+          <w:rFonts w:ascii="Times New Roman" w:hAnsi="Times New Roman" w:cs="Times New Roman"/>
           <w:b/>
           <w:bCs/>
           <w:spacing w:val="-4"/>
-          <w:lang w:val="pt-BR"/>
-        </w:rPr>
-      </w:pPr>
-      <w:r>
-        <w:rPr>
+          <w:sz w:val="40"/>
+          <w:szCs w:val="40"/>
+          <w:lang w:val="pt-BR"/>
+        </w:rPr>
+      </w:pPr>
+      <w:r>
+        <w:rPr>
+          <w:spacing w:val="-4"/>
+          <w:lang w:val="pt-BR"/>
+        </w:rPr>
+        <w:t xml:space="preserve">    </w:t>
+      </w:r>
+      <w:r>
+        <w:rPr>
+          <w:rFonts w:ascii="Times New Roman" w:hAnsi="Times New Roman" w:cs="Times New Roman"/>
           <w:b/>
           <w:bCs/>
           <w:spacing w:val="-4"/>
-          <w:lang w:val="pt-BR"/>
-        </w:rPr>
-        <w:t>RESUMO DE INVESTIMENTOS E AÇÕES – {</w:t>
+          <w:sz w:val="40"/>
+          <w:szCs w:val="40"/>
+          <w:lang w:val="pt-BR"/>
+        </w:rPr>
+        <w:t>{</w:t>
       </w:r>
       <w:proofErr w:type="spellStart"/>
       <w:r>
         <w:rPr>
+          <w:rFonts w:ascii="Times New Roman" w:hAnsi="Times New Roman" w:cs="Times New Roman"/>
           <w:b/>
           <w:bCs/>
           <w:spacing w:val="-4"/>
+          <w:sz w:val="40"/>
+          <w:szCs w:val="40"/>
           <w:lang w:val="pt-BR"/>
         </w:rPr>
         <w:t>municipio</w:t>
@@ -74,9 +54,12 @@
       <w:proofErr w:type="spellEnd"/>
       <w:r>
         <w:rPr>
+          <w:rFonts w:ascii="Times New Roman" w:hAnsi="Times New Roman" w:cs="Times New Roman"/>
           <w:b/>
           <w:bCs/>
           <w:spacing w:val="-4"/>
+          <w:sz w:val="40"/>
+          <w:szCs w:val="40"/>
           <w:lang w:val="pt-BR"/>
         </w:rPr>
         <w:t>}</w:t>
@@ -88,19 +71,43 @@
         <w:tabs>
           <w:tab w:val="left" w:pos="1714"/>
         </w:tabs>
-        <w:spacing w:before="188" w:line="360" w:lineRule="auto"/>
-        <w:rPr>
-          <w:spacing w:val="-4"/>
-          <w:lang w:val="pt-BR"/>
-        </w:rPr>
-      </w:pPr>
-      <w:r>
-        <w:rPr>
+        <w:spacing w:line="276" w:lineRule="auto"/>
+        <w:rPr>
+          <w:rFonts w:ascii="Times New Roman" w:hAnsi="Times New Roman" w:cs="Times New Roman"/>
+          <w:spacing w:val="-4"/>
+          <w:lang w:val="pt-BR"/>
+        </w:rPr>
+      </w:pPr>
+      <w:r>
+        <w:rPr>
+          <w:rFonts w:ascii="Times New Roman" w:hAnsi="Times New Roman" w:cs="Times New Roman"/>
+          <w:spacing w:val="-4"/>
+          <w:lang w:val="pt-BR"/>
+        </w:rPr>
+        <w:t xml:space="preserve">RESUMO DE INVESTIMENTOS E AÇÕES </w:t>
+      </w:r>
+    </w:p>
+    <w:p>
+      <w:pPr>
+        <w:pStyle w:val="Corpodetexto"/>
+        <w:tabs>
+          <w:tab w:val="left" w:pos="1714"/>
+        </w:tabs>
+        <w:spacing w:line="276" w:lineRule="auto"/>
+        <w:rPr>
+          <w:rFonts w:ascii="Times New Roman" w:hAnsi="Times New Roman" w:cs="Times New Roman"/>
+          <w:spacing w:val="-4"/>
+          <w:lang w:val="pt-BR"/>
+        </w:rPr>
+      </w:pPr>
+      <w:r>
+        <w:rPr>
+          <w:rFonts w:ascii="Times New Roman" w:hAnsi="Times New Roman" w:cs="Times New Roman"/>
           <w:spacing w:val="-4"/>
           <w:lang w:val="pt-BR"/>
         </w:rPr>
         <w:pict w14:anchorId="3AD6FB7D">
-          <v:rect id="_x0000_i1025" style="width:0;height:1.5pt" o:hralign="center" o:hrstd="t" o:hr="t" fillcolor="#a0a0a0" stroked="f"/>
+          <v:rect id="_x0000_i1037" style="width:0;height:1.5pt" o:hralign="center" o:hrstd="t" o:hr="t" fillcolor="#a0a0a0" stroked="f"/>
         </w:pict>
       </w:r>
     </w:p>
@@ -110,8 +117,9 @@
         <w:tabs>
           <w:tab w:val="left" w:pos="1714"/>
         </w:tabs>
-        <w:spacing w:before="188" w:line="360" w:lineRule="auto"/>
-        <w:rPr>
+        <w:spacing w:line="276" w:lineRule="auto"/>
+        <w:rPr>
+          <w:rFonts w:ascii="Times New Roman" w:hAnsi="Times New Roman" w:cs="Times New Roman"/>
           <w:b/>
           <w:bCs/>
           <w:spacing w:val="-4"/>
@@ -120,6 +128,7 @@
       </w:pPr>
       <w:r>
         <w:rPr>
+          <w:rFonts w:ascii="Times New Roman" w:hAnsi="Times New Roman" w:cs="Times New Roman"/>
           <w:b/>
           <w:bCs/>
           <w:spacing w:val="-4"/>
@@ -134,25 +143,35 @@
         <w:tabs>
           <w:tab w:val="left" w:pos="1714"/>
         </w:tabs>
-        <w:spacing w:before="188" w:line="360" w:lineRule="auto"/>
-        <w:rPr>
-          <w:spacing w:val="-4"/>
-          <w:lang w:val="pt-BR"/>
-        </w:rPr>
-      </w:pPr>
-      <w:r>
-        <w:rPr>
+        <w:spacing w:line="276" w:lineRule="auto"/>
+        <w:rPr>
+          <w:rFonts w:ascii="Times New Roman" w:hAnsi="Times New Roman" w:cs="Times New Roman"/>
+          <w:spacing w:val="-4"/>
+          <w:lang w:val="pt-BR"/>
+        </w:rPr>
+      </w:pPr>
+      <w:r>
+        <w:rPr>
+          <w:rFonts w:ascii="Times New Roman" w:hAnsi="Times New Roman" w:cs="Times New Roman"/>
           <w:spacing w:val="-4"/>
           <w:lang w:val="pt-BR"/>
         </w:rPr>
         <w:pict w14:anchorId="647ACDEA">
-          <v:rect id="_x0000_i1026" style="width:0;height:1.5pt" o:hralign="center" o:hrstd="t" o:hr="t" fillcolor="#a0a0a0" stroked="f"/>
+          <v:rect id="_x0000_i1038" style="width:0;height:1.5pt" o:hralign="center" o:hrstd="t" o:hr="t" fillcolor="#a0a0a0" stroked="f"/>
         </w:pict>
       </w:r>
     </w:p>
     <w:tbl>
       <w:tblPr>
-        <w:tblW w:w="0" w:type="auto"/>
+        <w:tblW w:w="9060" w:type="dxa"/>
+        <w:tblBorders>
+          <w:top w:val="single" w:sz="4" w:space="0" w:color="auto"/>
+          <w:left w:val="single" w:sz="4" w:space="0" w:color="auto"/>
+          <w:bottom w:val="single" w:sz="4" w:space="0" w:color="auto"/>
+          <w:right w:val="single" w:sz="4" w:space="0" w:color="auto"/>
+          <w:insideH w:val="single" w:sz="4" w:space="0" w:color="auto"/>
+          <w:insideV w:val="single" w:sz="4" w:space="0" w:color="auto"/>
+        </w:tblBorders>
         <w:tblCellMar>
           <w:top w:w="15" w:type="dxa"/>
           <w:left w:w="15" w:type="dxa"/>
@@ -162,19 +181,16 @@
         <w:tblLook w:val="04A0" w:firstRow="1" w:lastRow="0" w:firstColumn="1" w:lastColumn="0" w:noHBand="0" w:noVBand="1"/>
       </w:tblPr>
       <w:tblGrid>
-        <w:gridCol w:w="4500"/>
-        <w:gridCol w:w="4513"/>
+        <w:gridCol w:w="4528"/>
+        <w:gridCol w:w="4532"/>
       </w:tblGrid>
       <w:tr>
+        <w:trPr>
+          <w:trHeight w:val="983"/>
+        </w:trPr>
         <w:tc>
           <w:tcPr>
-            <w:tcW w:w="0" w:type="auto"/>
-            <w:tcBorders>
-              <w:top w:val="single" w:sz="6" w:space="0" w:color="E2E8F0"/>
-              <w:left w:val="single" w:sz="6" w:space="0" w:color="E2E8F0"/>
-              <w:bottom w:val="single" w:sz="6" w:space="0" w:color="E2E8F0"/>
-              <w:right w:val="single" w:sz="6" w:space="0" w:color="E2E8F0"/>
-            </w:tcBorders>
+            <w:tcW w:w="4528" w:type="dxa"/>
             <w:shd w:val="clear" w:color="auto" w:fill="F8FAFC"/>
             <w:tcMar>
               <w:top w:w="180" w:type="dxa"/>
@@ -190,14 +206,113 @@
               <w:tabs>
                 <w:tab w:val="left" w:pos="1714"/>
               </w:tabs>
-              <w:spacing w:before="188" w:line="360" w:lineRule="auto"/>
+              <w:spacing w:line="276" w:lineRule="auto"/>
               <w:rPr>
+                <w:rFonts w:ascii="Times New Roman" w:hAnsi="Times New Roman" w:cs="Times New Roman"/>
                 <w:spacing w:val="-4"/>
                 <w:lang w:val="pt-BR"/>
               </w:rPr>
             </w:pPr>
             <w:r>
               <w:rPr>
+                <w:rFonts w:ascii="Times New Roman" w:hAnsi="Times New Roman" w:cs="Times New Roman"/>
+                <w:spacing w:val="-4"/>
+                <w:lang w:val="pt-BR"/>
+              </w:rPr>
+              <w:t>Investimentos atendidos/publicados:</w:t>
+            </w:r>
+          </w:p>
+          <w:p>
+            <w:pPr>
+              <w:pStyle w:val="Corpodetexto"/>
+              <w:tabs>
+                <w:tab w:val="left" w:pos="1714"/>
+              </w:tabs>
+              <w:spacing w:line="276" w:lineRule="auto"/>
+              <w:rPr>
+                <w:rFonts w:ascii="Times New Roman" w:hAnsi="Times New Roman" w:cs="Times New Roman"/>
+                <w:b/>
+                <w:bCs/>
+                <w:spacing w:val="-4"/>
+                <w:lang w:val="pt-BR"/>
+              </w:rPr>
+            </w:pPr>
+            <w:r>
+              <w:rPr>
+                <w:rFonts w:ascii="Times New Roman" w:hAnsi="Times New Roman" w:cs="Times New Roman"/>
+                <w:b/>
+                <w:bCs/>
+                <w:spacing w:val="-4"/>
+                <w:lang w:val="pt-BR"/>
+              </w:rPr>
+              <w:t>{</w:t>
+            </w:r>
+            <w:proofErr w:type="spellStart"/>
+            <w:r>
+              <w:rPr>
+                <w:rFonts w:ascii="Times New Roman" w:hAnsi="Times New Roman" w:cs="Times New Roman"/>
+                <w:b/>
+                <w:bCs/>
+                <w:spacing w:val="-4"/>
+                <w:lang w:val="pt-BR"/>
+              </w:rPr>
+              <w:t>investimentoMi</w:t>
+            </w:r>
+            <w:proofErr w:type="spellEnd"/>
+            <w:r>
+              <w:rPr>
+                <w:rFonts w:ascii="Times New Roman" w:hAnsi="Times New Roman" w:cs="Times New Roman"/>
+                <w:b/>
+                <w:bCs/>
+                <w:spacing w:val="-4"/>
+                <w:lang w:val="pt-BR"/>
+              </w:rPr>
+              <w:t>}</w:t>
+            </w:r>
+          </w:p>
+          <w:p>
+            <w:pPr>
+              <w:pStyle w:val="Corpodetexto"/>
+              <w:tabs>
+                <w:tab w:val="left" w:pos="1714"/>
+              </w:tabs>
+              <w:spacing w:line="276" w:lineRule="auto"/>
+              <w:rPr>
+                <w:rFonts w:ascii="Times New Roman" w:hAnsi="Times New Roman" w:cs="Times New Roman"/>
+                <w:spacing w:val="-4"/>
+                <w:lang w:val="pt-BR"/>
+              </w:rPr>
+            </w:pPr>
+          </w:p>
+        </w:tc>
+        <w:tc>
+          <w:tcPr>
+            <w:tcW w:w="4532" w:type="dxa"/>
+            <w:shd w:val="clear" w:color="auto" w:fill="F8FAFC"/>
+            <w:tcMar>
+              <w:top w:w="180" w:type="dxa"/>
+              <w:left w:w="240" w:type="dxa"/>
+              <w:bottom w:w="180" w:type="dxa"/>
+              <w:right w:w="240" w:type="dxa"/>
+            </w:tcMar>
+            <w:hideMark/>
+          </w:tcPr>
+          <w:p>
+            <w:pPr>
+              <w:pStyle w:val="Corpodetexto"/>
+              <w:tabs>
+                <w:tab w:val="left" w:pos="1714"/>
+              </w:tabs>
+              <w:spacing w:line="276" w:lineRule="auto"/>
+              <w:rPr>
+                <w:rFonts w:ascii="Times New Roman" w:hAnsi="Times New Roman" w:cs="Times New Roman"/>
+                <w:spacing w:val="-4"/>
+                <w:lang w:val="pt-BR"/>
+              </w:rPr>
+            </w:pPr>
+            <w:r>
+              <w:rPr>
+                <w:rFonts w:ascii="Times New Roman" w:hAnsi="Times New Roman" w:cs="Times New Roman"/>
                 <w:spacing w:val="-4"/>
                 <w:lang w:val="pt-BR"/>
               </w:rPr>
@@ -205,6 +320,7 @@
             </w:r>
             <w:r>
               <w:rPr>
+                <w:rFonts w:ascii="Times New Roman" w:hAnsi="Times New Roman" w:cs="Times New Roman"/>
                 <w:b/>
                 <w:bCs/>
                 <w:color w:val="1F497D" w:themeColor="text2"/>
@@ -216,6 +332,7 @@
             <w:proofErr w:type="spellStart"/>
             <w:r>
               <w:rPr>
+                <w:rFonts w:ascii="Times New Roman" w:hAnsi="Times New Roman" w:cs="Times New Roman"/>
                 <w:b/>
                 <w:bCs/>
                 <w:color w:val="1F497D" w:themeColor="text2"/>
@@ -227,6 +344,7 @@
             <w:proofErr w:type="spellEnd"/>
             <w:r>
               <w:rPr>
+                <w:rFonts w:ascii="Times New Roman" w:hAnsi="Times New Roman" w:cs="Times New Roman"/>
                 <w:b/>
                 <w:bCs/>
                 <w:color w:val="1F497D" w:themeColor="text2"/>
@@ -242,40 +360,16 @@
               <w:tabs>
                 <w:tab w:val="left" w:pos="1714"/>
               </w:tabs>
-              <w:spacing w:before="188" w:line="360" w:lineRule="auto"/>
+              <w:spacing w:line="276" w:lineRule="auto"/>
               <w:rPr>
-                <w:spacing w:val="-4"/>
-                <w:lang w:val="pt-BR"/>
-              </w:rPr>
-            </w:pPr>
-          </w:p>
-          <w:p>
-            <w:pPr>
-              <w:pStyle w:val="Corpodetexto"/>
-              <w:tabs>
-                <w:tab w:val="left" w:pos="1714"/>
-              </w:tabs>
-              <w:spacing w:before="188" w:line="360" w:lineRule="auto"/>
-              <w:rPr>
-                <w:spacing w:val="-4"/>
-                <w:lang w:val="pt-BR"/>
-              </w:rPr>
-            </w:pPr>
-          </w:p>
-          <w:p>
-            <w:pPr>
-              <w:pStyle w:val="Corpodetexto"/>
-              <w:tabs>
-                <w:tab w:val="left" w:pos="1714"/>
-              </w:tabs>
-              <w:spacing w:before="188" w:line="360" w:lineRule="auto"/>
-              <w:rPr>
+                <w:rFonts w:ascii="Times New Roman" w:hAnsi="Times New Roman" w:cs="Times New Roman"/>
                 <w:spacing w:val="-4"/>
                 <w:lang w:val="pt-BR"/>
               </w:rPr>
             </w:pPr>
             <w:r>
               <w:rPr>
+                <w:rFonts w:ascii="Times New Roman" w:hAnsi="Times New Roman" w:cs="Times New Roman"/>
                 <w:spacing w:val="-4"/>
                 <w:lang w:val="pt-BR"/>
               </w:rPr>
@@ -283,6 +377,7 @@
             </w:r>
             <w:r>
               <w:rPr>
+                <w:rFonts w:ascii="Times New Roman" w:hAnsi="Times New Roman" w:cs="Times New Roman"/>
                 <w:b/>
                 <w:bCs/>
                 <w:color w:val="00B050"/>
@@ -298,73 +393,9 @@
               <w:tabs>
                 <w:tab w:val="left" w:pos="1714"/>
               </w:tabs>
-              <w:spacing w:before="188" w:line="360" w:lineRule="auto"/>
+              <w:spacing w:line="276" w:lineRule="auto"/>
               <w:rPr>
-                <w:spacing w:val="-4"/>
-                <w:lang w:val="pt-BR"/>
-              </w:rPr>
-            </w:pPr>
-          </w:p>
-          <w:p>
-            <w:pPr>
-              <w:pStyle w:val="Corpodetexto"/>
-              <w:tabs>
-                <w:tab w:val="left" w:pos="1714"/>
-              </w:tabs>
-              <w:spacing w:before="188" w:line="360" w:lineRule="auto"/>
-              <w:rPr>
-                <w:spacing w:val="-4"/>
-                <w:lang w:val="pt-BR"/>
-              </w:rPr>
-            </w:pPr>
-          </w:p>
-        </w:tc>
-        <w:tc>
-          <w:tcPr>
-            <w:tcW w:w="0" w:type="auto"/>
-            <w:tcBorders>
-              <w:top w:val="single" w:sz="6" w:space="0" w:color="E2E8F0"/>
-              <w:left w:val="single" w:sz="6" w:space="0" w:color="E2E8F0"/>
-              <w:bottom w:val="single" w:sz="6" w:space="0" w:color="E2E8F0"/>
-              <w:right w:val="single" w:sz="6" w:space="0" w:color="E2E8F0"/>
-            </w:tcBorders>
-            <w:shd w:val="clear" w:color="auto" w:fill="F8FAFC"/>
-            <w:tcMar>
-              <w:top w:w="180" w:type="dxa"/>
-              <w:left w:w="240" w:type="dxa"/>
-              <w:bottom w:w="180" w:type="dxa"/>
-              <w:right w:w="240" w:type="dxa"/>
-            </w:tcMar>
-            <w:hideMark/>
-          </w:tcPr>
-          <w:p>
-            <w:pPr>
-              <w:pStyle w:val="Corpodetexto"/>
-              <w:tabs>
-                <w:tab w:val="left" w:pos="1714"/>
-              </w:tabs>
-              <w:spacing w:before="188" w:line="360" w:lineRule="auto"/>
-              <w:rPr>
-                <w:spacing w:val="-4"/>
-                <w:lang w:val="pt-BR"/>
-              </w:rPr>
-            </w:pPr>
-            <w:r>
-              <w:rPr>
-                <w:spacing w:val="-4"/>
-                <w:lang w:val="pt-BR"/>
-              </w:rPr>
-              <w:t>Investimentos atendidos/publicados:</w:t>
-            </w:r>
-          </w:p>
-          <w:p>
-            <w:pPr>
-              <w:pStyle w:val="Corpodetexto"/>
-              <w:tabs>
-                <w:tab w:val="left" w:pos="1714"/>
-              </w:tabs>
-              <w:spacing w:before="188" w:line="360" w:lineRule="auto"/>
-              <w:rPr>
+                <w:rFonts w:ascii="Times New Roman" w:hAnsi="Times New Roman" w:cs="Times New Roman"/>
                 <w:b/>
                 <w:bCs/>
                 <w:spacing w:val="-4"/>
@@ -373,63 +404,7 @@
             </w:pPr>
             <w:r>
               <w:rPr>
-                <w:b/>
-                <w:bCs/>
-                <w:spacing w:val="-4"/>
-                <w:lang w:val="pt-BR"/>
-              </w:rPr>
-              <w:t>{</w:t>
-            </w:r>
-            <w:proofErr w:type="spellStart"/>
-            <w:r>
-              <w:rPr>
-                <w:b/>
-                <w:bCs/>
-                <w:spacing w:val="-4"/>
-                <w:lang w:val="pt-BR"/>
-              </w:rPr>
-              <w:t>investimentoMi</w:t>
-            </w:r>
-            <w:proofErr w:type="spellEnd"/>
-            <w:r>
-              <w:rPr>
-                <w:b/>
-                <w:bCs/>
-                <w:spacing w:val="-4"/>
-                <w:lang w:val="pt-BR"/>
-              </w:rPr>
-              <w:t>}</w:t>
-            </w:r>
-          </w:p>
-          <w:p>
-            <w:pPr>
-              <w:pStyle w:val="Corpodetexto"/>
-              <w:tabs>
-                <w:tab w:val="left" w:pos="1714"/>
-              </w:tabs>
-              <w:spacing w:before="188" w:line="360" w:lineRule="auto"/>
-              <w:rPr>
-                <w:spacing w:val="-4"/>
-                <w:lang w:val="pt-BR"/>
-              </w:rPr>
-            </w:pPr>
-          </w:p>
-          <w:p>
-            <w:pPr>
-              <w:pStyle w:val="Corpodetexto"/>
-              <w:tabs>
-                <w:tab w:val="left" w:pos="1714"/>
-              </w:tabs>
-              <w:spacing w:before="188" w:line="360" w:lineRule="auto"/>
-              <w:rPr>
-                <w:b/>
-                <w:bCs/>
-                <w:spacing w:val="-4"/>
-                <w:lang w:val="pt-BR"/>
-              </w:rPr>
-            </w:pPr>
-            <w:r>
-              <w:rPr>
+                <w:rFonts w:ascii="Times New Roman" w:hAnsi="Times New Roman" w:cs="Times New Roman"/>
                 <w:spacing w:val="-4"/>
                 <w:lang w:val="pt-BR"/>
               </w:rPr>
@@ -437,6 +412,7 @@
             </w:r>
             <w:r>
               <w:rPr>
+                <w:rFonts w:ascii="Times New Roman" w:hAnsi="Times New Roman" w:cs="Times New Roman"/>
                 <w:b/>
                 <w:bCs/>
                 <w:color w:val="C00000"/>
@@ -448,6 +424,7 @@
             <w:proofErr w:type="spellStart"/>
             <w:r>
               <w:rPr>
+                <w:rFonts w:ascii="Times New Roman" w:hAnsi="Times New Roman" w:cs="Times New Roman"/>
                 <w:b/>
                 <w:bCs/>
                 <w:color w:val="C00000"/>
@@ -459,6 +436,7 @@
             <w:proofErr w:type="spellEnd"/>
             <w:r>
               <w:rPr>
+                <w:rFonts w:ascii="Times New Roman" w:hAnsi="Times New Roman" w:cs="Times New Roman"/>
                 <w:b/>
                 <w:bCs/>
                 <w:color w:val="C00000"/>
@@ -477,28 +455,47 @@
         <w:tabs>
           <w:tab w:val="left" w:pos="1714"/>
         </w:tabs>
-        <w:spacing w:before="188" w:line="360" w:lineRule="auto"/>
-        <w:rPr>
-          <w:spacing w:val="-4"/>
-          <w:lang w:val="pt-BR"/>
-        </w:rPr>
-      </w:pPr>
-      <w:r>
-        <w:rPr>
+        <w:spacing w:line="276" w:lineRule="auto"/>
+        <w:rPr>
+          <w:rFonts w:ascii="Times New Roman" w:hAnsi="Times New Roman" w:cs="Times New Roman"/>
           <w:b/>
           <w:bCs/>
           <w:spacing w:val="-4"/>
           <w:lang w:val="pt-BR"/>
         </w:rPr>
-        <w:t xml:space="preserve">**DESTAQUES – INVESTIMENTOS ATENDIDOS** </w:t>
-      </w:r>
-      <w:r>
-        <w:rPr>
+      </w:pPr>
+    </w:p>
+    <w:p>
+      <w:pPr>
+        <w:pStyle w:val="Corpodetexto"/>
+        <w:tabs>
+          <w:tab w:val="left" w:pos="1714"/>
+        </w:tabs>
+        <w:spacing w:line="276" w:lineRule="auto"/>
+        <w:rPr>
+          <w:rFonts w:ascii="Times New Roman" w:hAnsi="Times New Roman" w:cs="Times New Roman"/>
+          <w:spacing w:val="-4"/>
+          <w:lang w:val="pt-BR"/>
+        </w:rPr>
+      </w:pPr>
+      <w:r>
+        <w:rPr>
+          <w:rFonts w:ascii="Times New Roman" w:hAnsi="Times New Roman" w:cs="Times New Roman"/>
+          <w:b/>
+          <w:bCs/>
+          <w:spacing w:val="-4"/>
+          <w:lang w:val="pt-BR"/>
+        </w:rPr>
+        <w:t>*INVESTIMENTOS ATENDIDOS*</w:t>
+      </w:r>
+      <w:r>
+        <w:rPr>
+          <w:rFonts w:ascii="Times New Roman" w:hAnsi="Times New Roman" w:cs="Times New Roman"/>
           <w:spacing w:val="-4"/>
           <w:lang w:val="pt-BR"/>
         </w:rPr>
         <w:pict w14:anchorId="563A77B4">
-          <v:rect id="_x0000_i1027" style="width:0;height:1.5pt" o:hralign="center" o:hrstd="t" o:hr="t" fillcolor="#a0a0a0" stroked="f"/>
+          <v:rect id="_x0000_i1039" style="width:0;height:1.5pt" o:hralign="center" o:hrstd="t" o:hr="t" fillcolor="#a0a0a0" stroked="f"/>
         </w:pict>
       </w:r>
     </w:p>
@@ -508,14 +505,16 @@
         <w:tabs>
           <w:tab w:val="left" w:pos="1714"/>
         </w:tabs>
-        <w:spacing w:before="188" w:line="360" w:lineRule="auto"/>
-        <w:rPr>
-          <w:spacing w:val="-4"/>
-          <w:lang w:val="pt-BR"/>
-        </w:rPr>
-      </w:pPr>
-      <w:r>
-        <w:rPr>
+        <w:spacing w:line="276" w:lineRule="auto"/>
+        <w:rPr>
+          <w:rFonts w:ascii="Times New Roman" w:hAnsi="Times New Roman" w:cs="Times New Roman"/>
+          <w:spacing w:val="-4"/>
+          <w:lang w:val="pt-BR"/>
+        </w:rPr>
+      </w:pPr>
+      <w:r>
+        <w:rPr>
+          <w:rFonts w:ascii="Times New Roman" w:hAnsi="Times New Roman" w:cs="Times New Roman"/>
           <w:spacing w:val="-4"/>
           <w:lang w:val="pt-BR"/>
         </w:rPr>
@@ -528,12 +527,82 @@
         <w:tabs>
           <w:tab w:val="left" w:pos="1714"/>
         </w:tabs>
-        <w:spacing w:before="188" w:line="360" w:lineRule="auto"/>
-        <w:rPr>
-          <w:spacing w:val="-4"/>
-          <w:lang w:val="pt-BR"/>
-        </w:rPr>
-      </w:pPr>
+        <w:spacing w:line="276" w:lineRule="auto"/>
+        <w:rPr>
+          <w:rFonts w:ascii="Times New Roman" w:hAnsi="Times New Roman" w:cs="Times New Roman"/>
+          <w:color w:val="1F497D" w:themeColor="text2"/>
+          <w:spacing w:val="-4"/>
+          <w:lang w:val="pt-BR"/>
+        </w:rPr>
+      </w:pPr>
+      <w:r>
+        <w:rPr>
+          <w:rFonts w:ascii="Times New Roman" w:hAnsi="Times New Roman" w:cs="Times New Roman"/>
+          <w:color w:val="1F497D" w:themeColor="text2"/>
+          <w:spacing w:val="-4"/>
+          <w:lang w:val="pt-BR"/>
+        </w:rPr>
+        <w:t>*</w:t>
+      </w:r>
+      <w:r>
+        <w:rPr>
+          <w:rFonts w:ascii="Times New Roman" w:hAnsi="Times New Roman" w:cs="Times New Roman"/>
+          <w:b/>
+          <w:bCs/>
+          <w:color w:val="0F243E" w:themeColor="text2" w:themeShade="80"/>
+          <w:spacing w:val="-4"/>
+          <w:lang w:val="pt-BR"/>
+        </w:rPr>
+        <w:t>{organ}</w:t>
+      </w:r>
+      <w:r>
+        <w:rPr>
+          <w:rFonts w:ascii="Times New Roman" w:hAnsi="Times New Roman" w:cs="Times New Roman"/>
+          <w:color w:val="1F497D" w:themeColor="text2"/>
+          <w:spacing w:val="-4"/>
+          <w:lang w:val="pt-BR"/>
+        </w:rPr>
+        <w:t>: {totalItens} ITENS*</w:t>
+      </w:r>
+      <w:r>
+        <w:rPr>
+          <w:rFonts w:ascii="Times New Roman" w:hAnsi="Times New Roman" w:cs="Times New Roman"/>
+          <w:color w:val="1F497D" w:themeColor="text2"/>
+          <w:spacing w:val="-4"/>
+          <w:lang w:val="pt-BR"/>
+        </w:rPr>
+        <w:br/>
+        <w:t xml:space="preserve">*TOTAL: </w:t>
+      </w:r>
+      <w:r>
+        <w:rPr>
+          <w:rFonts w:ascii="Times New Roman" w:hAnsi="Times New Roman" w:cs="Times New Roman"/>
+          <w:b/>
+          <w:bCs/>
+          <w:color w:val="1F497D" w:themeColor="text2"/>
+          <w:spacing w:val="-4"/>
+          <w:lang w:val="pt-BR"/>
+        </w:rPr>
+        <w:t>{total}</w:t>
+      </w:r>
+      <w:r>
+        <w:rPr>
+          <w:rFonts w:ascii="Times New Roman" w:hAnsi="Times New Roman" w:cs="Times New Roman"/>
+          <w:color w:val="1F497D" w:themeColor="text2"/>
+          <w:spacing w:val="-4"/>
+          <w:lang w:val="pt-BR"/>
+        </w:rPr>
+        <w:t>*</w:t>
+      </w:r>
+      <w:r>
+        <w:rPr>
+          <w:rFonts w:ascii="Times New Roman" w:hAnsi="Times New Roman" w:cs="Times New Roman"/>
+          <w:spacing w:val="-4"/>
+          <w:lang w:val="pt-BR"/>
+        </w:rPr>
+        <w:br/>
+        <w:t>{#itens}</w:t>
+      </w:r>
     </w:p>
     <w:p>
       <w:pPr>
@@ -541,56 +610,30 @@
         <w:tabs>
           <w:tab w:val="left" w:pos="1714"/>
         </w:tabs>
-        <w:spacing w:before="188" w:line="360" w:lineRule="auto"/>
-        <w:rPr>
-          <w:color w:val="1F497D" w:themeColor="text2"/>
-          <w:spacing w:val="-4"/>
-          <w:lang w:val="pt-BR"/>
-        </w:rPr>
-      </w:pPr>
-      <w:r>
-        <w:rPr>
-          <w:color w:val="1F497D" w:themeColor="text2"/>
-          <w:spacing w:val="-4"/>
-          <w:lang w:val="pt-BR"/>
-        </w:rPr>
-        <w:t>**{</w:t>
-      </w:r>
-      <w:proofErr w:type="spellStart"/>
-      <w:r>
-        <w:rPr>
-          <w:color w:val="1F497D" w:themeColor="text2"/>
-          <w:spacing w:val="-4"/>
-          <w:lang w:val="pt-BR"/>
-        </w:rPr>
-        <w:t>organ</w:t>
-      </w:r>
-      <w:proofErr w:type="spellEnd"/>
-      <w:r>
-        <w:rPr>
-          <w:color w:val="1F497D" w:themeColor="text2"/>
-          <w:spacing w:val="-4"/>
-          <w:lang w:val="pt-BR"/>
-        </w:rPr>
-        <w:t>} — {</w:t>
-      </w:r>
-      <w:proofErr w:type="spellStart"/>
-      <w:r>
-        <w:rPr>
-          <w:color w:val="1F497D" w:themeColor="text2"/>
-          <w:spacing w:val="-4"/>
-          <w:lang w:val="pt-BR"/>
-        </w:rPr>
-        <w:t>totalItens</w:t>
-      </w:r>
-      <w:proofErr w:type="spellEnd"/>
-      <w:r>
-        <w:rPr>
-          <w:color w:val="1F497D" w:themeColor="text2"/>
-          <w:spacing w:val="-4"/>
-          <w:lang w:val="pt-BR"/>
-        </w:rPr>
-        <w:t>} ITENS**</w:t>
+        <w:spacing w:line="276" w:lineRule="auto"/>
+        <w:rPr>
+          <w:rFonts w:ascii="Times New Roman" w:hAnsi="Times New Roman" w:cs="Times New Roman"/>
+          <w:spacing w:val="-4"/>
+          <w:lang w:val="pt-BR"/>
+        </w:rPr>
+      </w:pPr>
+      <w:r>
+        <w:rPr>
+          <w:rFonts w:ascii="Times New Roman" w:hAnsi="Times New Roman" w:cs="Times New Roman"/>
+          <w:spacing w:val="-4"/>
+          <w:lang w:val="pt-BR"/>
+        </w:rPr>
+        <w:t xml:space="preserve">• {desc} - </w:t>
+      </w:r>
+      <w:r>
+        <w:rPr>
+          <w:rFonts w:ascii="Times New Roman" w:hAnsi="Times New Roman" w:cs="Times New Roman"/>
+          <w:b/>
+          <w:bCs/>
+          <w:spacing w:val="-4"/>
+          <w:lang w:val="pt-BR"/>
+        </w:rPr>
+        <w:t>{valor}</w:t>
       </w:r>
     </w:p>
     <w:p>
@@ -599,25 +642,20 @@
         <w:tabs>
           <w:tab w:val="left" w:pos="1714"/>
         </w:tabs>
-        <w:spacing w:before="188" w:line="360" w:lineRule="auto"/>
-        <w:rPr>
-          <w:spacing w:val="-4"/>
-          <w:lang w:val="pt-BR"/>
-        </w:rPr>
-      </w:pPr>
-      <w:r>
-        <w:rPr>
-          <w:spacing w:val="-4"/>
-          <w:lang w:val="pt-BR"/>
-        </w:rPr>
-        <w:br/>
-      </w:r>
-      <w:r>
-        <w:rPr>
-          <w:spacing w:val="-4"/>
-          <w:lang w:val="pt-BR"/>
-        </w:rPr>
-        <w:t>{#itens}</w:t>
+        <w:spacing w:line="276" w:lineRule="auto"/>
+        <w:rPr>
+          <w:rFonts w:ascii="Times New Roman" w:hAnsi="Times New Roman" w:cs="Times New Roman"/>
+          <w:spacing w:val="-4"/>
+          <w:lang w:val="pt-BR"/>
+        </w:rPr>
+      </w:pPr>
+      <w:r>
+        <w:rPr>
+          <w:rFonts w:ascii="Times New Roman" w:hAnsi="Times New Roman" w:cs="Times New Roman"/>
+          <w:spacing w:val="-4"/>
+          <w:lang w:val="pt-BR"/>
+        </w:rPr>
+        <w:t>{/itens}</w:t>
       </w:r>
     </w:p>
     <w:p>
@@ -626,12 +664,21 @@
         <w:tabs>
           <w:tab w:val="left" w:pos="1714"/>
         </w:tabs>
-        <w:spacing w:before="188" w:line="360" w:lineRule="auto"/>
-        <w:rPr>
-          <w:spacing w:val="-4"/>
-          <w:lang w:val="pt-BR"/>
-        </w:rPr>
-      </w:pPr>
+        <w:spacing w:line="276" w:lineRule="auto"/>
+        <w:rPr>
+          <w:rFonts w:ascii="Times New Roman" w:hAnsi="Times New Roman" w:cs="Times New Roman"/>
+          <w:spacing w:val="-4"/>
+          <w:lang w:val="pt-BR"/>
+        </w:rPr>
+      </w:pPr>
+      <w:r>
+        <w:rPr>
+          <w:rFonts w:ascii="Times New Roman" w:hAnsi="Times New Roman" w:cs="Times New Roman"/>
+          <w:spacing w:val="-4"/>
+          <w:lang w:val="pt-BR"/>
+        </w:rPr>
+        <w:t>{/destaques}</w:t>
+      </w:r>
     </w:p>
     <w:p>
       <w:pPr>
@@ -639,197 +686,77 @@
         <w:tabs>
           <w:tab w:val="left" w:pos="1714"/>
         </w:tabs>
-        <w:spacing w:before="188" w:line="360" w:lineRule="auto"/>
-        <w:rPr>
-          <w:spacing w:val="-4"/>
-          <w:lang w:val="pt-BR"/>
-        </w:rPr>
-      </w:pPr>
-      <w:r>
-        <w:rPr>
-          <w:spacing w:val="-4"/>
-          <w:lang w:val="pt-BR"/>
-        </w:rPr>
-        <w:t>{valor} - {</w:t>
-      </w:r>
-      <w:proofErr w:type="spellStart"/>
-      <w:r>
-        <w:rPr>
-          <w:spacing w:val="-4"/>
-          <w:lang w:val="pt-BR"/>
-        </w:rPr>
-        <w:t>desc</w:t>
-      </w:r>
-      <w:proofErr w:type="spellEnd"/>
-      <w:r>
-        <w:rPr>
-          <w:spacing w:val="-4"/>
-          <w:lang w:val="pt-BR"/>
-        </w:rPr>
-        <w:t>}</w:t>
-      </w:r>
-    </w:p>
-    <w:p>
-      <w:pPr>
-        <w:pStyle w:val="Corpodetexto"/>
-        <w:tabs>
-          <w:tab w:val="left" w:pos="1714"/>
-        </w:tabs>
-        <w:spacing w:before="188" w:line="360" w:lineRule="auto"/>
-        <w:rPr>
-          <w:spacing w:val="-4"/>
-          <w:lang w:val="pt-BR"/>
-        </w:rPr>
-      </w:pPr>
-    </w:p>
-    <w:p>
-      <w:pPr>
-        <w:pStyle w:val="Corpodetexto"/>
-        <w:tabs>
-          <w:tab w:val="left" w:pos="1714"/>
-        </w:tabs>
-        <w:spacing w:before="188" w:line="360" w:lineRule="auto"/>
-        <w:rPr>
-          <w:spacing w:val="-4"/>
-          <w:lang w:val="pt-BR"/>
-        </w:rPr>
-      </w:pPr>
-      <w:r>
-        <w:rPr>
-          <w:spacing w:val="-4"/>
-          <w:lang w:val="pt-BR"/>
-        </w:rPr>
-        <w:t>{/itens}</w:t>
-      </w:r>
-    </w:p>
-    <w:p>
-      <w:pPr>
-        <w:pStyle w:val="Corpodetexto"/>
-        <w:tabs>
-          <w:tab w:val="left" w:pos="1714"/>
-        </w:tabs>
-        <w:spacing w:before="188" w:line="360" w:lineRule="auto"/>
-        <w:rPr>
-          <w:spacing w:val="-4"/>
-          <w:lang w:val="pt-BR"/>
-        </w:rPr>
-      </w:pPr>
-    </w:p>
-    <w:p>
-      <w:pPr>
-        <w:pStyle w:val="Corpodetexto"/>
-        <w:tabs>
-          <w:tab w:val="left" w:pos="1714"/>
-        </w:tabs>
-        <w:spacing w:before="188" w:line="360" w:lineRule="auto"/>
-        <w:rPr>
-          <w:color w:val="1F497D" w:themeColor="text2"/>
-          <w:spacing w:val="-4"/>
-          <w:lang w:val="pt-BR"/>
-        </w:rPr>
-      </w:pPr>
-      <w:r>
-        <w:rPr>
-          <w:color w:val="1F497D" w:themeColor="text2"/>
-          <w:spacing w:val="-4"/>
-          <w:lang w:val="pt-BR"/>
-        </w:rPr>
-        <w:t>**Total {</w:t>
-      </w:r>
-      <w:proofErr w:type="spellStart"/>
-      <w:r>
-        <w:rPr>
-          <w:color w:val="1F497D" w:themeColor="text2"/>
-          <w:spacing w:val="-4"/>
-          <w:lang w:val="pt-BR"/>
-        </w:rPr>
-        <w:t>organ</w:t>
-      </w:r>
-      <w:proofErr w:type="spellEnd"/>
-      <w:r>
-        <w:rPr>
-          <w:color w:val="1F497D" w:themeColor="text2"/>
-          <w:spacing w:val="-4"/>
-          <w:lang w:val="pt-BR"/>
-        </w:rPr>
-        <w:t>}: {total}**</w:t>
-      </w:r>
-    </w:p>
-    <w:p>
-      <w:pPr>
-        <w:pStyle w:val="Corpodetexto"/>
-        <w:tabs>
-          <w:tab w:val="left" w:pos="1714"/>
-        </w:tabs>
-        <w:spacing w:before="188" w:line="360" w:lineRule="auto"/>
-        <w:rPr>
-          <w:spacing w:val="-4"/>
-          <w:lang w:val="pt-BR"/>
-        </w:rPr>
-      </w:pPr>
-    </w:p>
-    <w:p>
-      <w:pPr>
-        <w:pStyle w:val="Corpodetexto"/>
-        <w:tabs>
-          <w:tab w:val="left" w:pos="1714"/>
-        </w:tabs>
-        <w:spacing w:before="188" w:line="360" w:lineRule="auto"/>
-        <w:rPr>
-          <w:spacing w:val="-4"/>
-          <w:lang w:val="pt-BR"/>
-        </w:rPr>
-      </w:pPr>
-      <w:r>
-        <w:rPr>
-          <w:spacing w:val="-4"/>
-          <w:lang w:val="pt-BR"/>
-        </w:rPr>
-        <w:t>{/destaques}</w:t>
-      </w:r>
-    </w:p>
-    <w:p>
-      <w:pPr>
-        <w:pStyle w:val="Corpodetexto"/>
-        <w:tabs>
-          <w:tab w:val="left" w:pos="1714"/>
-        </w:tabs>
-        <w:spacing w:before="188" w:line="360" w:lineRule="auto"/>
-        <w:rPr>
-          <w:spacing w:val="-4"/>
-          <w:lang w:val="pt-BR"/>
-        </w:rPr>
-      </w:pPr>
-    </w:p>
-    <w:p>
-      <w:pPr>
-        <w:pStyle w:val="Corpodetexto"/>
-        <w:tabs>
-          <w:tab w:val="left" w:pos="1714"/>
-        </w:tabs>
-        <w:spacing w:before="188" w:line="360" w:lineRule="auto"/>
-        <w:rPr>
-          <w:spacing w:val="-4"/>
-          <w:lang w:val="pt-BR"/>
-        </w:rPr>
-      </w:pPr>
-      <w:r>
-        <w:rPr>
+        <w:spacing w:line="276" w:lineRule="auto"/>
+        <w:rPr>
+          <w:rFonts w:ascii="Times New Roman" w:hAnsi="Times New Roman" w:cs="Times New Roman"/>
           <w:b/>
           <w:bCs/>
           <w:color w:val="EE0000"/>
           <w:spacing w:val="-4"/>
           <w:lang w:val="pt-BR"/>
         </w:rPr>
+      </w:pPr>
+    </w:p>
+    <w:p>
+      <w:pPr>
+        <w:pStyle w:val="Corpodetexto"/>
+        <w:tabs>
+          <w:tab w:val="left" w:pos="1714"/>
+        </w:tabs>
+        <w:spacing w:line="276" w:lineRule="auto"/>
+        <w:rPr>
+          <w:rFonts w:ascii="Times New Roman" w:hAnsi="Times New Roman" w:cs="Times New Roman"/>
+          <w:b/>
+          <w:bCs/>
+          <w:color w:val="EE0000"/>
+          <w:spacing w:val="-4"/>
+          <w:lang w:val="pt-BR"/>
+        </w:rPr>
+      </w:pPr>
+    </w:p>
+    <w:p>
+      <w:pPr>
+        <w:pStyle w:val="Corpodetexto"/>
+        <w:tabs>
+          <w:tab w:val="left" w:pos="1714"/>
+        </w:tabs>
+        <w:spacing w:line="276" w:lineRule="auto"/>
+        <w:rPr>
+          <w:rFonts w:ascii="Times New Roman" w:hAnsi="Times New Roman" w:cs="Times New Roman"/>
+          <w:spacing w:val="-4"/>
+          <w:lang w:val="pt-BR"/>
+        </w:rPr>
+      </w:pPr>
+      <w:r>
+        <w:rPr>
+          <w:rFonts w:ascii="Times New Roman" w:hAnsi="Times New Roman" w:cs="Times New Roman"/>
+          <w:b/>
+          <w:bCs/>
+          <w:color w:val="EE0000"/>
+          <w:spacing w:val="-4"/>
+          <w:lang w:val="pt-BR"/>
+        </w:rPr>
+        <w:t xml:space="preserve">   </w:t>
+      </w:r>
+      <w:r>
+        <w:rPr>
+          <w:rFonts w:ascii="Times New Roman" w:hAnsi="Times New Roman" w:cs="Times New Roman"/>
+          <w:b/>
+          <w:bCs/>
+          <w:color w:val="EE0000"/>
+          <w:spacing w:val="-4"/>
+          <w:lang w:val="pt-BR"/>
+        </w:rPr>
         <w:t xml:space="preserve">**PLEITOS EM ABERTO** </w:t>
       </w:r>
       <w:r>
         <w:rPr>
+          <w:rFonts w:ascii="Times New Roman" w:hAnsi="Times New Roman" w:cs="Times New Roman"/>
           <w:spacing w:val="-4"/>
           <w:lang w:val="pt-BR"/>
         </w:rPr>
         <w:pict w14:anchorId="1C0F0B3C">
-          <v:rect id="_x0000_i1028" style="width:0;height:1.5pt" o:hralign="center" o:hrstd="t" o:hr="t" fillcolor="#a0a0a0" stroked="f"/>
+          <v:rect id="_x0000_i1040" style="width:0;height:1.5pt" o:hralign="center" o:hrstd="t" o:hr="t" fillcolor="#a0a0a0" stroked="f"/>
         </w:pict>
       </w:r>
     </w:p>
@@ -839,14 +766,24 @@
         <w:tabs>
           <w:tab w:val="left" w:pos="1714"/>
         </w:tabs>
-        <w:spacing w:before="188" w:line="360" w:lineRule="auto"/>
-        <w:rPr>
-          <w:spacing w:val="-4"/>
-          <w:lang w:val="pt-BR"/>
-        </w:rPr>
-      </w:pPr>
-      <w:r>
-        <w:rPr>
+        <w:spacing w:line="276" w:lineRule="auto"/>
+        <w:rPr>
+          <w:rFonts w:ascii="Times New Roman" w:hAnsi="Times New Roman" w:cs="Times New Roman"/>
+          <w:spacing w:val="-4"/>
+          <w:lang w:val="pt-BR"/>
+        </w:rPr>
+      </w:pPr>
+      <w:r>
+        <w:rPr>
+          <w:rFonts w:ascii="Times New Roman" w:hAnsi="Times New Roman" w:cs="Times New Roman"/>
+          <w:spacing w:val="-4"/>
+          <w:lang w:val="pt-BR"/>
+        </w:rPr>
+        <w:t xml:space="preserve">   </w:t>
+      </w:r>
+      <w:r>
+        <w:rPr>
+          <w:rFonts w:ascii="Times New Roman" w:hAnsi="Times New Roman" w:cs="Times New Roman"/>
           <w:spacing w:val="-4"/>
           <w:lang w:val="pt-BR"/>
         </w:rPr>
@@ -859,9 +796,9 @@
         <w:tabs>
           <w:tab w:val="left" w:pos="1714"/>
         </w:tabs>
-        <w:spacing w:before="188" w:line="360" w:lineRule="auto"/>
-        <w:rPr>
-          <w:rFonts w:ascii="Segoe UI Emoji" w:hAnsi="Segoe UI Emoji" w:cs="Segoe UI Emoji"/>
+        <w:spacing w:line="276" w:lineRule="auto"/>
+        <w:rPr>
+          <w:rFonts w:ascii="Times New Roman" w:hAnsi="Times New Roman" w:cs="Times New Roman"/>
           <w:color w:val="1F497D" w:themeColor="text2"/>
           <w:spacing w:val="-4"/>
           <w:lang w:val="pt-BR"/>
@@ -869,52 +806,230 @@
       </w:pPr>
       <w:r>
         <w:rPr>
-          <w:rFonts w:ascii="Segoe UI Emoji" w:hAnsi="Segoe UI Emoji" w:cs="Segoe UI Emoji"/>
+          <w:rFonts w:ascii="Times New Roman" w:hAnsi="Times New Roman" w:cs="Times New Roman"/>
           <w:color w:val="1F497D" w:themeColor="text2"/>
           <w:spacing w:val="-4"/>
           <w:lang w:val="pt-BR"/>
         </w:rPr>
-        <w:t>**• {</w:t>
+        <w:t xml:space="preserve">   </w:t>
+      </w:r>
+      <w:r>
+        <w:rPr>
+          <w:rFonts w:ascii="Times New Roman" w:hAnsi="Times New Roman" w:cs="Times New Roman"/>
+          <w:color w:val="1F497D" w:themeColor="text2"/>
+          <w:spacing w:val="-4"/>
+          <w:lang w:val="pt-BR"/>
+        </w:rPr>
+        <w:t>*</w:t>
+      </w:r>
+      <w:r>
+        <w:rPr>
+          <w:rFonts w:ascii="Times New Roman" w:hAnsi="Times New Roman" w:cs="Times New Roman"/>
+          <w:b/>
+          <w:bCs/>
+          <w:color w:val="0F243E" w:themeColor="text2" w:themeShade="80"/>
+          <w:spacing w:val="-4"/>
+          <w:lang w:val="pt-BR"/>
+        </w:rPr>
+        <w:t>{</w:t>
       </w:r>
       <w:proofErr w:type="spellStart"/>
       <w:r>
         <w:rPr>
-          <w:rFonts w:ascii="Segoe UI Emoji" w:hAnsi="Segoe UI Emoji" w:cs="Segoe UI Emoji"/>
+          <w:rFonts w:ascii="Times New Roman" w:hAnsi="Times New Roman" w:cs="Times New Roman"/>
+          <w:b/>
+          <w:bCs/>
+          <w:color w:val="0F243E" w:themeColor="text2" w:themeShade="80"/>
+          <w:spacing w:val="-4"/>
+          <w:lang w:val="pt-BR"/>
+        </w:rPr>
+        <w:t>orgao</w:t>
+      </w:r>
+      <w:proofErr w:type="spellEnd"/>
+      <w:r>
+        <w:rPr>
+          <w:rFonts w:ascii="Times New Roman" w:hAnsi="Times New Roman" w:cs="Times New Roman"/>
+          <w:b/>
+          <w:bCs/>
+          <w:color w:val="0F243E" w:themeColor="text2" w:themeShade="80"/>
+          <w:spacing w:val="-4"/>
+          <w:lang w:val="pt-BR"/>
+        </w:rPr>
+        <w:t>}</w:t>
+      </w:r>
+      <w:r>
+        <w:rPr>
+          <w:rFonts w:ascii="Times New Roman" w:hAnsi="Times New Roman" w:cs="Times New Roman"/>
           <w:color w:val="1F497D" w:themeColor="text2"/>
           <w:spacing w:val="-4"/>
           <w:lang w:val="pt-BR"/>
         </w:rPr>
+        <w:t>: {</w:t>
+      </w:r>
+      <w:proofErr w:type="spellStart"/>
+      <w:r>
+        <w:rPr>
+          <w:rFonts w:ascii="Times New Roman" w:hAnsi="Times New Roman" w:cs="Times New Roman"/>
+          <w:color w:val="1F497D" w:themeColor="text2"/>
+          <w:spacing w:val="-4"/>
+          <w:lang w:val="pt-BR"/>
+        </w:rPr>
+        <w:t>totalItens</w:t>
+      </w:r>
+      <w:proofErr w:type="spellEnd"/>
+      <w:r>
+        <w:rPr>
+          <w:rFonts w:ascii="Times New Roman" w:hAnsi="Times New Roman" w:cs="Times New Roman"/>
+          <w:color w:val="1F497D" w:themeColor="text2"/>
+          <w:spacing w:val="-4"/>
+          <w:lang w:val="pt-BR"/>
+        </w:rPr>
+        <w:t>} ITENS*</w:t>
+      </w:r>
+      <w:r>
+        <w:rPr>
+          <w:rFonts w:ascii="Times New Roman" w:hAnsi="Times New Roman" w:cs="Times New Roman"/>
+          <w:color w:val="1F497D" w:themeColor="text2"/>
+          <w:spacing w:val="-4"/>
+          <w:lang w:val="pt-BR"/>
+        </w:rPr>
+        <w:br/>
+      </w:r>
+      <w:r>
+        <w:rPr>
+          <w:rFonts w:ascii="Times New Roman" w:hAnsi="Times New Roman" w:cs="Times New Roman"/>
+          <w:color w:val="1F497D" w:themeColor="text2"/>
+          <w:spacing w:val="-4"/>
+          <w:lang w:val="pt-BR"/>
+        </w:rPr>
+        <w:t xml:space="preserve">   </w:t>
+      </w:r>
+      <w:r>
+        <w:rPr>
+          <w:rFonts w:ascii="Times New Roman" w:hAnsi="Times New Roman" w:cs="Times New Roman"/>
+          <w:color w:val="1F497D" w:themeColor="text2"/>
+          <w:spacing w:val="-4"/>
+          <w:lang w:val="pt-BR"/>
+        </w:rPr>
+        <w:t>*TOTAL {</w:t>
+      </w:r>
+      <w:proofErr w:type="spellStart"/>
+      <w:r>
+        <w:rPr>
+          <w:rFonts w:ascii="Times New Roman" w:hAnsi="Times New Roman" w:cs="Times New Roman"/>
+          <w:color w:val="1F497D" w:themeColor="text2"/>
+          <w:spacing w:val="-4"/>
+          <w:lang w:val="pt-BR"/>
+        </w:rPr>
         <w:t>orgao</w:t>
       </w:r>
       <w:proofErr w:type="spellEnd"/>
       <w:r>
         <w:rPr>
-          <w:rFonts w:ascii="Segoe UI Emoji" w:hAnsi="Segoe UI Emoji" w:cs="Segoe UI Emoji"/>
+          <w:rFonts w:ascii="Times New Roman" w:hAnsi="Times New Roman" w:cs="Times New Roman"/>
           <w:color w:val="1F497D" w:themeColor="text2"/>
           <w:spacing w:val="-4"/>
           <w:lang w:val="pt-BR"/>
         </w:rPr>
-        <w:t>} — {</w:t>
+        <w:t xml:space="preserve">}: </w:t>
+      </w:r>
+      <w:r>
+        <w:rPr>
+          <w:rFonts w:ascii="Times New Roman" w:hAnsi="Times New Roman" w:cs="Times New Roman"/>
+          <w:b/>
+          <w:bCs/>
+          <w:color w:val="1F497D" w:themeColor="text2"/>
+          <w:spacing w:val="-4"/>
+          <w:lang w:val="pt-BR"/>
+        </w:rPr>
+        <w:t>{total}</w:t>
+      </w:r>
+      <w:r>
+        <w:rPr>
+          <w:rFonts w:ascii="Times New Roman" w:hAnsi="Times New Roman" w:cs="Times New Roman"/>
+          <w:color w:val="1F497D" w:themeColor="text2"/>
+          <w:spacing w:val="-4"/>
+          <w:lang w:val="pt-BR"/>
+        </w:rPr>
+        <w:t>*</w:t>
+      </w:r>
+    </w:p>
+    <w:p>
+      <w:pPr>
+        <w:pStyle w:val="Corpodetexto"/>
+        <w:tabs>
+          <w:tab w:val="left" w:pos="1714"/>
+        </w:tabs>
+        <w:spacing w:line="276" w:lineRule="auto"/>
+        <w:rPr>
+          <w:rFonts w:ascii="Times New Roman" w:hAnsi="Times New Roman" w:cs="Times New Roman"/>
+          <w:spacing w:val="-4"/>
+          <w:lang w:val="pt-BR"/>
+        </w:rPr>
+      </w:pPr>
+      <w:r>
+        <w:rPr>
+          <w:rFonts w:ascii="Times New Roman" w:hAnsi="Times New Roman" w:cs="Times New Roman"/>
+          <w:spacing w:val="-4"/>
+          <w:lang w:val="pt-BR"/>
+        </w:rPr>
+        <w:t xml:space="preserve">   </w:t>
+      </w:r>
+      <w:r>
+        <w:rPr>
+          <w:rFonts w:ascii="Times New Roman" w:hAnsi="Times New Roman" w:cs="Times New Roman"/>
+          <w:spacing w:val="-4"/>
+          <w:lang w:val="pt-BR"/>
+        </w:rPr>
+        <w:t>{#itens}</w:t>
+      </w:r>
+    </w:p>
+    <w:p>
+      <w:pPr>
+        <w:pStyle w:val="Corpodetexto"/>
+        <w:tabs>
+          <w:tab w:val="left" w:pos="1714"/>
+        </w:tabs>
+        <w:spacing w:line="276" w:lineRule="auto"/>
+        <w:rPr>
+          <w:rFonts w:ascii="Times New Roman" w:hAnsi="Times New Roman" w:cs="Times New Roman"/>
+          <w:spacing w:val="-4"/>
+          <w:lang w:val="pt-BR"/>
+        </w:rPr>
+      </w:pPr>
+      <w:r>
+        <w:rPr>
+          <w:rFonts w:ascii="Times New Roman" w:hAnsi="Times New Roman" w:cs="Times New Roman"/>
+          <w:spacing w:val="-4"/>
+          <w:lang w:val="pt-BR"/>
+        </w:rPr>
+        <w:t xml:space="preserve">   </w:t>
+      </w:r>
+      <w:r>
+        <w:rPr>
+          <w:rFonts w:ascii="Times New Roman" w:hAnsi="Times New Roman" w:cs="Times New Roman"/>
+          <w:spacing w:val="-4"/>
+          <w:lang w:val="pt-BR"/>
+        </w:rPr>
+        <w:t>• {</w:t>
       </w:r>
       <w:proofErr w:type="spellStart"/>
       <w:r>
         <w:rPr>
-          <w:rFonts w:ascii="Segoe UI Emoji" w:hAnsi="Segoe UI Emoji" w:cs="Segoe UI Emoji"/>
-          <w:color w:val="1F497D" w:themeColor="text2"/>
-          <w:spacing w:val="-4"/>
-          <w:lang w:val="pt-BR"/>
-        </w:rPr>
-        <w:t>totalItens</w:t>
+          <w:rFonts w:ascii="Times New Roman" w:hAnsi="Times New Roman" w:cs="Times New Roman"/>
+          <w:spacing w:val="-4"/>
+          <w:lang w:val="pt-BR"/>
+        </w:rPr>
+        <w:t>descricao</w:t>
       </w:r>
       <w:proofErr w:type="spellEnd"/>
       <w:r>
         <w:rPr>
-          <w:rFonts w:ascii="Segoe UI Emoji" w:hAnsi="Segoe UI Emoji" w:cs="Segoe UI Emoji"/>
-          <w:color w:val="1F497D" w:themeColor="text2"/>
-          <w:spacing w:val="-4"/>
-          <w:lang w:val="pt-BR"/>
-        </w:rPr>
-        <w:t>} ITENS**</w:t>
+          <w:rFonts w:ascii="Times New Roman" w:hAnsi="Times New Roman" w:cs="Times New Roman"/>
+          <w:spacing w:val="-4"/>
+          <w:lang w:val="pt-BR"/>
+        </w:rPr>
+        <w:t>}</w:t>
       </w:r>
     </w:p>
     <w:p>
@@ -923,13 +1038,29 @@
         <w:tabs>
           <w:tab w:val="left" w:pos="1714"/>
         </w:tabs>
-        <w:spacing w:before="188" w:line="360" w:lineRule="auto"/>
-        <w:rPr>
-          <w:rFonts w:ascii="Segoe UI Emoji" w:hAnsi="Segoe UI Emoji" w:cs="Segoe UI Emoji"/>
-          <w:spacing w:val="-4"/>
-          <w:lang w:val="pt-BR"/>
-        </w:rPr>
-      </w:pPr>
+        <w:spacing w:line="276" w:lineRule="auto"/>
+        <w:rPr>
+          <w:rFonts w:ascii="Times New Roman" w:hAnsi="Times New Roman" w:cs="Times New Roman"/>
+          <w:spacing w:val="-4"/>
+          <w:lang w:val="pt-BR"/>
+        </w:rPr>
+      </w:pPr>
+      <w:r>
+        <w:rPr>
+          <w:rFonts w:ascii="Times New Roman" w:hAnsi="Times New Roman" w:cs="Times New Roman"/>
+          <w:spacing w:val="-4"/>
+          <w:lang w:val="pt-BR"/>
+        </w:rPr>
+        <w:t xml:space="preserve">   </w:t>
+      </w:r>
+      <w:r>
+        <w:rPr>
+          <w:rFonts w:ascii="Times New Roman" w:hAnsi="Times New Roman" w:cs="Times New Roman"/>
+          <w:spacing w:val="-4"/>
+          <w:lang w:val="pt-BR"/>
+        </w:rPr>
+        <w:t>{/itens}</w:t>
+      </w:r>
     </w:p>
     <w:p>
       <w:pPr>
@@ -937,200 +1068,38 @@
         <w:tabs>
           <w:tab w:val="left" w:pos="1714"/>
         </w:tabs>
-        <w:spacing w:before="188" w:line="360" w:lineRule="auto"/>
-        <w:rPr>
-          <w:spacing w:val="-4"/>
-          <w:lang w:val="pt-BR"/>
-        </w:rPr>
-      </w:pPr>
-      <w:r>
-        <w:rPr>
-          <w:spacing w:val="-4"/>
-          <w:lang w:val="pt-BR"/>
-        </w:rPr>
-        <w:t>{#itens}</w:t>
+        <w:spacing w:line="276" w:lineRule="auto"/>
+        <w:rPr>
+          <w:rFonts w:ascii="Times New Roman" w:hAnsi="Times New Roman" w:cs="Times New Roman"/>
+          <w:spacing w:val="-4"/>
+          <w:lang w:val="pt-BR"/>
+        </w:rPr>
+      </w:pPr>
+      <w:r>
+        <w:rPr>
+          <w:rFonts w:ascii="Times New Roman" w:hAnsi="Times New Roman" w:cs="Times New Roman"/>
+          <w:spacing w:val="-4"/>
+          <w:lang w:val="pt-BR"/>
+        </w:rPr>
+        <w:t xml:space="preserve">   </w:t>
+      </w:r>
+      <w:r>
+        <w:rPr>
+          <w:rFonts w:ascii="Times New Roman" w:hAnsi="Times New Roman" w:cs="Times New Roman"/>
+          <w:spacing w:val="-4"/>
+          <w:lang w:val="pt-BR"/>
+        </w:rPr>
+        <w:t>{/abertos}</w:t>
       </w:r>
     </w:p>
     <w:p>
       <w:pPr>
         <w:pStyle w:val="Corpodetexto"/>
         <w:tabs>
+          <w:tab w:val="left" w:pos="0"/>
           <w:tab w:val="left" w:pos="1714"/>
         </w:tabs>
-        <w:spacing w:before="188" w:line="360" w:lineRule="auto"/>
-        <w:rPr>
-          <w:spacing w:val="-4"/>
-          <w:lang w:val="pt-BR"/>
-        </w:rPr>
-      </w:pPr>
-    </w:p>
-    <w:p>
-      <w:pPr>
-        <w:pStyle w:val="Corpodetexto"/>
-        <w:tabs>
-          <w:tab w:val="left" w:pos="1714"/>
-        </w:tabs>
-        <w:spacing w:before="188" w:line="360" w:lineRule="auto"/>
-        <w:rPr>
-          <w:rFonts w:ascii="Segoe UI Emoji" w:hAnsi="Segoe UI Emoji" w:cs="Segoe UI Emoji"/>
-          <w:spacing w:val="-4"/>
-          <w:lang w:val="pt-BR"/>
-        </w:rPr>
-      </w:pPr>
-      <w:r>
-        <w:rPr>
-          <w:rFonts w:ascii="Segoe UI Emoji" w:hAnsi="Segoe UI Emoji" w:cs="Segoe UI Emoji"/>
-          <w:spacing w:val="-4"/>
-          <w:lang w:val="pt-BR"/>
-        </w:rPr>
-        <w:t>• {</w:t>
-      </w:r>
-      <w:proofErr w:type="spellStart"/>
-      <w:r>
-        <w:rPr>
-          <w:rFonts w:ascii="Segoe UI Emoji" w:hAnsi="Segoe UI Emoji" w:cs="Segoe UI Emoji"/>
-          <w:spacing w:val="-4"/>
-          <w:lang w:val="pt-BR"/>
-        </w:rPr>
-        <w:t>descricao</w:t>
-      </w:r>
-      <w:proofErr w:type="spellEnd"/>
-      <w:r>
-        <w:rPr>
-          <w:rFonts w:ascii="Segoe UI Emoji" w:hAnsi="Segoe UI Emoji" w:cs="Segoe UI Emoji"/>
-          <w:spacing w:val="-4"/>
-          <w:lang w:val="pt-BR"/>
-        </w:rPr>
-        <w:t>}</w:t>
-      </w:r>
-    </w:p>
-    <w:p>
-      <w:pPr>
-        <w:pStyle w:val="Corpodetexto"/>
-        <w:tabs>
-          <w:tab w:val="left" w:pos="1714"/>
-        </w:tabs>
-        <w:spacing w:before="188" w:line="360" w:lineRule="auto"/>
-        <w:rPr>
-          <w:rFonts w:ascii="Segoe UI Emoji" w:hAnsi="Segoe UI Emoji" w:cs="Segoe UI Emoji"/>
-          <w:spacing w:val="-4"/>
-          <w:lang w:val="pt-BR"/>
-        </w:rPr>
-      </w:pPr>
-    </w:p>
-    <w:p>
-      <w:pPr>
-        <w:pStyle w:val="Corpodetexto"/>
-        <w:tabs>
-          <w:tab w:val="left" w:pos="1714"/>
-        </w:tabs>
-        <w:spacing w:before="188" w:line="360" w:lineRule="auto"/>
-        <w:rPr>
-          <w:spacing w:val="-4"/>
-          <w:lang w:val="pt-BR"/>
-        </w:rPr>
-      </w:pPr>
-      <w:r>
-        <w:rPr>
-          <w:spacing w:val="-4"/>
-          <w:lang w:val="pt-BR"/>
-        </w:rPr>
-        <w:t>{/itens}</w:t>
-      </w:r>
-    </w:p>
-    <w:p>
-      <w:pPr>
-        <w:pStyle w:val="Corpodetexto"/>
-        <w:tabs>
-          <w:tab w:val="left" w:pos="1714"/>
-        </w:tabs>
-        <w:spacing w:before="188" w:line="360" w:lineRule="auto"/>
-        <w:rPr>
-          <w:spacing w:val="-4"/>
-          <w:lang w:val="pt-BR"/>
-        </w:rPr>
-      </w:pPr>
-    </w:p>
-    <w:p>
-      <w:pPr>
-        <w:pStyle w:val="Corpodetexto"/>
-        <w:tabs>
-          <w:tab w:val="left" w:pos="1714"/>
-        </w:tabs>
-        <w:spacing w:before="188" w:line="360" w:lineRule="auto"/>
-        <w:rPr>
-          <w:color w:val="1F497D" w:themeColor="text2"/>
-          <w:spacing w:val="-4"/>
-          <w:lang w:val="pt-BR"/>
-        </w:rPr>
-      </w:pPr>
-      <w:r>
-        <w:rPr>
-          <w:color w:val="1F497D" w:themeColor="text2"/>
-          <w:spacing w:val="-4"/>
-          <w:lang w:val="pt-BR"/>
-        </w:rPr>
-        <w:t>**Total {</w:t>
-      </w:r>
-      <w:proofErr w:type="spellStart"/>
-      <w:r>
-        <w:rPr>
-          <w:color w:val="1F497D" w:themeColor="text2"/>
-          <w:spacing w:val="-4"/>
-          <w:lang w:val="pt-BR"/>
-        </w:rPr>
-        <w:t>orgao</w:t>
-      </w:r>
-      <w:proofErr w:type="spellEnd"/>
-      <w:r>
-        <w:rPr>
-          <w:color w:val="1F497D" w:themeColor="text2"/>
-          <w:spacing w:val="-4"/>
-          <w:lang w:val="pt-BR"/>
-        </w:rPr>
-        <w:t>}: {total}**</w:t>
-      </w:r>
-    </w:p>
-    <w:p>
-      <w:pPr>
-        <w:pStyle w:val="Corpodetexto"/>
-        <w:tabs>
-          <w:tab w:val="left" w:pos="1714"/>
-        </w:tabs>
-        <w:spacing w:before="188" w:line="360" w:lineRule="auto"/>
-        <w:rPr>
-          <w:spacing w:val="-4"/>
-          <w:lang w:val="pt-BR"/>
-        </w:rPr>
-      </w:pPr>
-    </w:p>
-    <w:p>
-      <w:pPr>
-        <w:pStyle w:val="Corpodetexto"/>
-        <w:tabs>
-          <w:tab w:val="left" w:pos="1714"/>
-        </w:tabs>
-        <w:spacing w:before="188" w:line="360" w:lineRule="auto"/>
-        <w:rPr>
-          <w:spacing w:val="-4"/>
-          <w:lang w:val="pt-BR"/>
-        </w:rPr>
-      </w:pPr>
-      <w:r>
-        <w:rPr>
-          <w:spacing w:val="-4"/>
-          <w:lang w:val="pt-BR"/>
-        </w:rPr>
-        <w:t>{/abertos}</w:t>
-      </w:r>
-    </w:p>
-    <w:p>
-      <w:pPr>
-        <w:pStyle w:val="Corpodetexto"/>
-        <w:tabs>
-          <w:tab w:val="left" w:pos="1714"/>
-        </w:tabs>
-        <w:spacing w:before="188" w:line="360" w:lineRule="auto"/>
+        <w:spacing w:line="276" w:lineRule="auto"/>
         <w:rPr>
           <w:rFonts w:ascii="Arial" w:hAnsi="Arial" w:cs="Arial"/>
           <w:spacing w:val="-4"/>
@@ -1138,14 +1107,9 @@
       </w:pPr>
     </w:p>
     <w:sectPr>
-      <w:headerReference w:type="even" r:id="rId7"/>
       <w:headerReference w:type="default" r:id="rId8"/>
-      <w:footerReference w:type="even" r:id="rId9"/>
-      <w:footerReference w:type="default" r:id="rId10"/>
-      <w:headerReference w:type="first" r:id="rId11"/>
-      <w:footerReference w:type="first" r:id="rId12"/>
       <w:pgSz w:w="11909" w:h="16834"/>
-      <w:pgMar w:top="1440" w:right="1440" w:bottom="1440" w:left="1440" w:header="720" w:footer="720" w:gutter="0"/>
+      <w:pgMar w:top="1797" w:right="1440" w:bottom="1440" w:left="1440" w:header="720" w:footer="720" w:gutter="0"/>
       <w:pgNumType w:start="1"/>
       <w:cols w:space="720"/>
     </w:sectPr>
@@ -1178,36 +1142,6 @@
 </w:endnotes>
 </file>
 
-<file path=word/footer1.xml><?xml version="1.0" encoding="utf-8"?>
-<w:ftr xmlns:wpc="http://schemas.microsoft.com/office/word/2010/wordprocessingCanvas" xmlns:cx="http://schemas.microsoft.com/office/drawing/2014/chartex" xmlns:cx1="http://schemas.microsoft.com/office/drawing/2015/9/8/chartex" xmlns:cx2="http://schemas.microsoft.com/office/drawing/2015/10/21/chartex" xmlns:cx3="http://schemas.microsoft.com/office/drawing/2016/5/9/chartex" xmlns:cx4="http://schemas.microsoft.com/office/drawing/2016/5/10/chartex" xmlns:cx5="http://schemas.microsoft.com/office/drawing/2016/5/11/chartex" xmlns:cx6="http://schemas.microsoft.com/office/drawing/2016/5/12/chartex" xmlns:cx7="http://schemas.microsoft.com/office/drawing/2016/5/13/chartex" xmlns:cx8="http://schemas.microsoft.com/office/drawing/2016/5/14/chartex" xmlns:mc="http://schemas.openxmlformats.org/markup-compatibility/2006" xmlns:aink="http://schemas.microsoft.com/office/drawing/2016/ink" xmlns:am3d="http://schemas.microsoft.com/office/drawing/2017/model3d" xmlns:o="urn:schemas-microsoft-com:office:office" xmlns:oel="http://schemas.microsoft.com/office/2019/extlst" xmlns:r="http://schemas.openxmlformats.org/officeDocument/2006/relationships" xmlns:m="http://schemas.openxmlformats.org/officeDocument/2006/math" xmlns:v="urn:schemas-microsoft-com:vml" xmlns:wp14="http://schemas.microsoft.com/office/word/2010/wordprocessingDrawing" xmlns:wp="http://schemas.openxmlformats.org/drawingml/2006/wordprocessingDrawing" xmlns:w10="urn:schemas-microsoft-com:office:word" xmlns:w="http://schemas.openxmlformats.org/wordprocessingml/2006/main" xmlns:w14="http://schemas.microsoft.com/office/word/2010/wordml" xmlns:w15="http://schemas.microsoft.com/office/word/2012/wordml" xmlns:w16cex="http://schemas.microsoft.com/office/word/2018/wordml/cex" xmlns:w16cid="http://schemas.microsoft.com/office/word/2016/wordml/cid" xmlns:w16="http://schemas.microsoft.com/office/word/2018/wordml" xmlns:w16du="http://schemas.microsoft.com/office/word/2023/wordml/word16du" xmlns:w16sdtdh="http://schemas.microsoft.com/office/word/2020/wordml/sdtdatahash" xmlns:w16sdtfl="http://schemas.microsoft.com/office/word/2024/wordml/sdtformatlock" xmlns:w16se="http://schemas.microsoft.com/office/word/2015/wordml/symex" xmlns:wpg="http://schemas.microsoft.com/office/word/2010/wordprocessingGroup" xmlns:wpi="http://schemas.microsoft.com/office/word/2010/wordprocessingInk" xmlns:wne="http://schemas.microsoft.com/office/word/2006/wordml" xmlns:wps="http://schemas.microsoft.com/office/word/2010/wordprocessingShape" mc:Ignorable="w14 w15 w16se w16cid w16 w16cex w16sdtdh w16sdtfl w16du wp14">
-  <w:p>
-    <w:pPr>
-      <w:pStyle w:val="Rodap"/>
-    </w:pPr>
-  </w:p>
-</w:ftr>
-</file>
-
-<file path=word/footer2.xml><?xml version="1.0" encoding="utf-8"?>
-<w:ftr xmlns:wpc="http://schemas.microsoft.com/office/word/2010/wordprocessingCanvas" xmlns:cx="http://schemas.microsoft.com/office/drawing/2014/chartex" xmlns:cx1="http://schemas.microsoft.com/office/drawing/2015/9/8/chartex" xmlns:cx2="http://schemas.microsoft.com/office/drawing/2015/10/21/chartex" xmlns:cx3="http://schemas.microsoft.com/office/drawing/2016/5/9/chartex" xmlns:cx4="http://schemas.microsoft.com/office/drawing/2016/5/10/chartex" xmlns:cx5="http://schemas.microsoft.com/office/drawing/2016/5/11/chartex" xmlns:cx6="http://schemas.microsoft.com/office/drawing/2016/5/12/chartex" xmlns:cx7="http://schemas.microsoft.com/office/drawing/2016/5/13/chartex" xmlns:cx8="http://schemas.microsoft.com/office/drawing/2016/5/14/chartex" xmlns:mc="http://schemas.openxmlformats.org/markup-compatibility/2006" xmlns:aink="http://schemas.microsoft.com/office/drawing/2016/ink" xmlns:am3d="http://schemas.microsoft.com/office/drawing/2017/model3d" xmlns:o="urn:schemas-microsoft-com:office:office" xmlns:oel="http://schemas.microsoft.com/office/2019/extlst" xmlns:r="http://schemas.openxmlformats.org/officeDocument/2006/relationships" xmlns:m="http://schemas.openxmlformats.org/officeDocument/2006/math" xmlns:v="urn:schemas-microsoft-com:vml" xmlns:wp14="http://schemas.microsoft.com/office/word/2010/wordprocessingDrawing" xmlns:wp="http://schemas.openxmlformats.org/drawingml/2006/wordprocessingDrawing" xmlns:w10="urn:schemas-microsoft-com:office:word" xmlns:w="http://schemas.openxmlformats.org/wordprocessingml/2006/main" xmlns:w14="http://schemas.microsoft.com/office/word/2010/wordml" xmlns:w15="http://schemas.microsoft.com/office/word/2012/wordml" xmlns:w16cex="http://schemas.microsoft.com/office/word/2018/wordml/cex" xmlns:w16cid="http://schemas.microsoft.com/office/word/2016/wordml/cid" xmlns:w16="http://schemas.microsoft.com/office/word/2018/wordml" xmlns:w16du="http://schemas.microsoft.com/office/word/2023/wordml/word16du" xmlns:w16sdtdh="http://schemas.microsoft.com/office/word/2020/wordml/sdtdatahash" xmlns:w16sdtfl="http://schemas.microsoft.com/office/word/2024/wordml/sdtformatlock" xmlns:w16se="http://schemas.microsoft.com/office/word/2015/wordml/symex" xmlns:wpg="http://schemas.microsoft.com/office/word/2010/wordprocessingGroup" xmlns:wpi="http://schemas.microsoft.com/office/word/2010/wordprocessingInk" xmlns:wne="http://schemas.microsoft.com/office/word/2006/wordml" xmlns:wps="http://schemas.microsoft.com/office/word/2010/wordprocessingShape" mc:Ignorable="w14 w15 w16se w16cid w16 w16cex w16sdtdh w16sdtfl w16du wp14">
-  <w:p>
-    <w:pPr>
-      <w:pStyle w:val="Rodap"/>
-    </w:pPr>
-  </w:p>
-</w:ftr>
-</file>
-
-<file path=word/footer3.xml><?xml version="1.0" encoding="utf-8"?>
-<w:ftr xmlns:wpc="http://schemas.microsoft.com/office/word/2010/wordprocessingCanvas" xmlns:cx="http://schemas.microsoft.com/office/drawing/2014/chartex" xmlns:cx1="http://schemas.microsoft.com/office/drawing/2015/9/8/chartex" xmlns:cx2="http://schemas.microsoft.com/office/drawing/2015/10/21/chartex" xmlns:cx3="http://schemas.microsoft.com/office/drawing/2016/5/9/chartex" xmlns:cx4="http://schemas.microsoft.com/office/drawing/2016/5/10/chartex" xmlns:cx5="http://schemas.microsoft.com/office/drawing/2016/5/11/chartex" xmlns:cx6="http://schemas.microsoft.com/office/drawing/2016/5/12/chartex" xmlns:cx7="http://schemas.microsoft.com/office/drawing/2016/5/13/chartex" xmlns:cx8="http://schemas.microsoft.com/office/drawing/2016/5/14/chartex" xmlns:mc="http://schemas.openxmlformats.org/markup-compatibility/2006" xmlns:aink="http://schemas.microsoft.com/office/drawing/2016/ink" xmlns:am3d="http://schemas.microsoft.com/office/drawing/2017/model3d" xmlns:o="urn:schemas-microsoft-com:office:office" xmlns:oel="http://schemas.microsoft.com/office/2019/extlst" xmlns:r="http://schemas.openxmlformats.org/officeDocument/2006/relationships" xmlns:m="http://schemas.openxmlformats.org/officeDocument/2006/math" xmlns:v="urn:schemas-microsoft-com:vml" xmlns:wp14="http://schemas.microsoft.com/office/word/2010/wordprocessingDrawing" xmlns:wp="http://schemas.openxmlformats.org/drawingml/2006/wordprocessingDrawing" xmlns:w10="urn:schemas-microsoft-com:office:word" xmlns:w="http://schemas.openxmlformats.org/wordprocessingml/2006/main" xmlns:w14="http://schemas.microsoft.com/office/word/2010/wordml" xmlns:w15="http://schemas.microsoft.com/office/word/2012/wordml" xmlns:w16cex="http://schemas.microsoft.com/office/word/2018/wordml/cex" xmlns:w16cid="http://schemas.microsoft.com/office/word/2016/wordml/cid" xmlns:w16="http://schemas.microsoft.com/office/word/2018/wordml" xmlns:w16du="http://schemas.microsoft.com/office/word/2023/wordml/word16du" xmlns:w16sdtdh="http://schemas.microsoft.com/office/word/2020/wordml/sdtdatahash" xmlns:w16sdtfl="http://schemas.microsoft.com/office/word/2024/wordml/sdtformatlock" xmlns:w16se="http://schemas.microsoft.com/office/word/2015/wordml/symex" xmlns:wpg="http://schemas.microsoft.com/office/word/2010/wordprocessingGroup" xmlns:wpi="http://schemas.microsoft.com/office/word/2010/wordprocessingInk" xmlns:wne="http://schemas.microsoft.com/office/word/2006/wordml" xmlns:wps="http://schemas.microsoft.com/office/word/2010/wordprocessingShape" mc:Ignorable="w14 w15 w16se w16cid w16 w16cex w16sdtdh w16sdtfl w16du wp14">
-  <w:p>
-    <w:pPr>
-      <w:pStyle w:val="Rodap"/>
-    </w:pPr>
-  </w:p>
-</w:ftr>
-</file>
-
 <file path=word/footnotes.xml><?xml version="1.0" encoding="utf-8"?>
 <w:footnotes xmlns:wpc="http://schemas.microsoft.com/office/word/2010/wordprocessingCanvas" xmlns:cx="http://schemas.microsoft.com/office/drawing/2014/chartex" xmlns:cx1="http://schemas.microsoft.com/office/drawing/2015/9/8/chartex" xmlns:cx2="http://schemas.microsoft.com/office/drawing/2015/10/21/chartex" xmlns:cx3="http://schemas.microsoft.com/office/drawing/2016/5/9/chartex" xmlns:cx4="http://schemas.microsoft.com/office/drawing/2016/5/10/chartex" xmlns:cx5="http://schemas.microsoft.com/office/drawing/2016/5/11/chartex" xmlns:cx6="http://schemas.microsoft.com/office/drawing/2016/5/12/chartex" xmlns:cx7="http://schemas.microsoft.com/office/drawing/2016/5/13/chartex" xmlns:cx8="http://schemas.microsoft.com/office/drawing/2016/5/14/chartex" xmlns:mc="http://schemas.openxmlformats.org/markup-compatibility/2006" xmlns:aink="http://schemas.microsoft.com/office/drawing/2016/ink" xmlns:am3d="http://schemas.microsoft.com/office/drawing/2017/model3d" xmlns:o="urn:schemas-microsoft-com:office:office" xmlns:oel="http://schemas.microsoft.com/office/2019/extlst" xmlns:r="http://schemas.openxmlformats.org/officeDocument/2006/relationships" xmlns:m="http://schemas.openxmlformats.org/officeDocument/2006/math" xmlns:v="urn:schemas-microsoft-com:vml" xmlns:wp14="http://schemas.microsoft.com/office/word/2010/wordprocessingDrawing" xmlns:wp="http://schemas.openxmlformats.org/drawingml/2006/wordprocessingDrawing" xmlns:w10="urn:schemas-microsoft-com:office:word" xmlns:w="http://schemas.openxmlformats.org/wordprocessingml/2006/main" xmlns:w14="http://schemas.microsoft.com/office/word/2010/wordml" xmlns:w15="http://schemas.microsoft.com/office/word/2012/wordml" xmlns:w16cex="http://schemas.microsoft.com/office/word/2018/wordml/cex" xmlns:w16cid="http://schemas.microsoft.com/office/word/2016/wordml/cid" xmlns:w16="http://schemas.microsoft.com/office/word/2018/wordml" xmlns:w16du="http://schemas.microsoft.com/office/word/2023/wordml/word16du" xmlns:w16sdtdh="http://schemas.microsoft.com/office/word/2020/wordml/sdtdatahash" xmlns:w16sdtfl="http://schemas.microsoft.com/office/word/2024/wordml/sdtformatlock" xmlns:w16se="http://schemas.microsoft.com/office/word/2015/wordml/symex" xmlns:wpg="http://schemas.microsoft.com/office/word/2010/wordprocessingGroup" xmlns:wpi="http://schemas.microsoft.com/office/word/2010/wordprocessingInk" xmlns:wne="http://schemas.microsoft.com/office/word/2006/wordml" xmlns:wps="http://schemas.microsoft.com/office/word/2010/wordprocessingShape" mc:Ignorable="w14 w15 w16se w16cid w16 w16cex w16sdtdh w16sdtfl w16du wp14">
   <w:footnote w:type="separator" w:id="-1">
@@ -1234,16 +1168,6 @@
 </file>
 
 <file path=word/header1.xml><?xml version="1.0" encoding="utf-8"?>
-<w:hdr xmlns:wpc="http://schemas.microsoft.com/office/word/2010/wordprocessingCanvas" xmlns:cx="http://schemas.microsoft.com/office/drawing/2014/chartex" xmlns:cx1="http://schemas.microsoft.com/office/drawing/2015/9/8/chartex" xmlns:cx2="http://schemas.microsoft.com/office/drawing/2015/10/21/chartex" xmlns:cx3="http://schemas.microsoft.com/office/drawing/2016/5/9/chartex" xmlns:cx4="http://schemas.microsoft.com/office/drawing/2016/5/10/chartex" xmlns:cx5="http://schemas.microsoft.com/office/drawing/2016/5/11/chartex" xmlns:cx6="http://schemas.microsoft.com/office/drawing/2016/5/12/chartex" xmlns:cx7="http://schemas.microsoft.com/office/drawing/2016/5/13/chartex" xmlns:cx8="http://schemas.microsoft.com/office/drawing/2016/5/14/chartex" xmlns:mc="http://schemas.openxmlformats.org/markup-compatibility/2006" xmlns:aink="http://schemas.microsoft.com/office/drawing/2016/ink" xmlns:am3d="http://schemas.microsoft.com/office/drawing/2017/model3d" xmlns:o="urn:schemas-microsoft-com:office:office" xmlns:oel="http://schemas.microsoft.com/office/2019/extlst" xmlns:r="http://schemas.openxmlformats.org/officeDocument/2006/relationships" xmlns:m="http://schemas.openxmlformats.org/officeDocument/2006/math" xmlns:v="urn:schemas-microsoft-com:vml" xmlns:wp14="http://schemas.microsoft.com/office/word/2010/wordprocessingDrawing" xmlns:wp="http://schemas.openxmlformats.org/drawingml/2006/wordprocessingDrawing" xmlns:w10="urn:schemas-microsoft-com:office:word" xmlns:w="http://schemas.openxmlformats.org/wordprocessingml/2006/main" xmlns:w14="http://schemas.microsoft.com/office/word/2010/wordml" xmlns:w15="http://schemas.microsoft.com/office/word/2012/wordml" xmlns:w16cex="http://schemas.microsoft.com/office/word/2018/wordml/cex" xmlns:w16cid="http://schemas.microsoft.com/office/word/2016/wordml/cid" xmlns:w16="http://schemas.microsoft.com/office/word/2018/wordml" xmlns:w16du="http://schemas.microsoft.com/office/word/2023/wordml/word16du" xmlns:w16sdtdh="http://schemas.microsoft.com/office/word/2020/wordml/sdtdatahash" xmlns:w16sdtfl="http://schemas.microsoft.com/office/word/2024/wordml/sdtformatlock" xmlns:w16se="http://schemas.microsoft.com/office/word/2015/wordml/symex" xmlns:wpg="http://schemas.microsoft.com/office/word/2010/wordprocessingGroup" xmlns:wpi="http://schemas.microsoft.com/office/word/2010/wordprocessingInk" xmlns:wne="http://schemas.microsoft.com/office/word/2006/wordml" xmlns:wps="http://schemas.microsoft.com/office/word/2010/wordprocessingShape" mc:Ignorable="w14 w15 w16se w16cid w16 w16cex w16sdtdh w16sdtfl w16du wp14">
-  <w:p>
-    <w:pPr>
-      <w:pStyle w:val="Cabealho"/>
-    </w:pPr>
-  </w:p>
-</w:hdr>
-</file>
-
-<file path=word/header2.xml><?xml version="1.0" encoding="utf-8"?>
 <w:hdr xmlns:wpc="http://schemas.microsoft.com/office/word/2010/wordprocessingCanvas" xmlns:cx="http://schemas.microsoft.com/office/drawing/2014/chartex" xmlns:cx1="http://schemas.microsoft.com/office/drawing/2015/9/8/chartex" xmlns:cx2="http://schemas.microsoft.com/office/drawing/2015/10/21/chartex" xmlns:cx3="http://schemas.microsoft.com/office/drawing/2016/5/9/chartex" xmlns:cx4="http://schemas.microsoft.com/office/drawing/2016/5/10/chartex" xmlns:cx5="http://schemas.microsoft.com/office/drawing/2016/5/11/chartex" xmlns:cx6="http://schemas.microsoft.com/office/drawing/2016/5/12/chartex" xmlns:cx7="http://schemas.microsoft.com/office/drawing/2016/5/13/chartex" xmlns:cx8="http://schemas.microsoft.com/office/drawing/2016/5/14/chartex" xmlns:mc="http://schemas.openxmlformats.org/markup-compatibility/2006" xmlns:aink="http://schemas.microsoft.com/office/drawing/2016/ink" xmlns:am3d="http://schemas.microsoft.com/office/drawing/2017/model3d" xmlns:o="urn:schemas-microsoft-com:office:office" xmlns:oel="http://schemas.microsoft.com/office/2019/extlst" xmlns:r="http://schemas.openxmlformats.org/officeDocument/2006/relationships" xmlns:m="http://schemas.openxmlformats.org/officeDocument/2006/math" xmlns:v="urn:schemas-microsoft-com:vml" xmlns:wp14="http://schemas.microsoft.com/office/word/2010/wordprocessingDrawing" xmlns:wp="http://schemas.openxmlformats.org/drawingml/2006/wordprocessingDrawing" xmlns:w10="urn:schemas-microsoft-com:office:word" xmlns:w="http://schemas.openxmlformats.org/wordprocessingml/2006/main" xmlns:w14="http://schemas.microsoft.com/office/word/2010/wordml" xmlns:w15="http://schemas.microsoft.com/office/word/2012/wordml" xmlns:w16cex="http://schemas.microsoft.com/office/word/2018/wordml/cex" xmlns:w16cid="http://schemas.microsoft.com/office/word/2016/wordml/cid" xmlns:w16="http://schemas.microsoft.com/office/word/2018/wordml" xmlns:w16du="http://schemas.microsoft.com/office/word/2023/wordml/word16du" xmlns:w16sdtdh="http://schemas.microsoft.com/office/word/2020/wordml/sdtdatahash" xmlns:w16sdtfl="http://schemas.microsoft.com/office/word/2024/wordml/sdtformatlock" xmlns:w16se="http://schemas.microsoft.com/office/word/2015/wordml/symex" xmlns:wpg="http://schemas.microsoft.com/office/word/2010/wordprocessingGroup" xmlns:wpi="http://schemas.microsoft.com/office/word/2010/wordprocessingInk" xmlns:wne="http://schemas.microsoft.com/office/word/2006/wordml" xmlns:wps="http://schemas.microsoft.com/office/word/2010/wordprocessingShape" mc:Ignorable="w14 w15 w16se w16cid w16 w16cex w16sdtdh w16sdtfl w16du wp14">
   <w:p>
     <w:r>
@@ -1267,22 +1191,12 @@
           <v:path o:extrusionok="f" gradientshapeok="t" o:connecttype="rect"/>
           <o:lock v:ext="edit" aspectratio="t"/>
         </v:shapetype>
-        <v:shape id="WordPictureWatermark1" o:spid="_x0000_s1025" type="#_x0000_t75" alt="" style="position:absolute;margin-left:-71.5pt;margin-top:-73.15pt;width:597.05pt;height:842.8pt;z-index:-251658752;mso-position-horizontal:absolute;mso-position-horizontal-relative:margin;mso-position-vertical:absolute;mso-position-vertical-relative:margin">
+        <v:shape id="WordPictureWatermark1" o:spid="_x0000_s1025" type="#_x0000_t75" alt="" style="position:absolute;margin-left:-63pt;margin-top:-90pt;width:597.05pt;height:842.8pt;z-index:-251658752;mso-position-horizontal-relative:margin;mso-position-vertical-relative:margin">
           <v:imagedata r:id="rId1" o:title="image1"/>
           <w10:wrap anchorx="margin" anchory="margin"/>
         </v:shape>
       </w:pict>
     </w:r>
-  </w:p>
-</w:hdr>
-</file>
-
-<file path=word/header3.xml><?xml version="1.0" encoding="utf-8"?>
-<w:hdr xmlns:wpc="http://schemas.microsoft.com/office/word/2010/wordprocessingCanvas" xmlns:cx="http://schemas.microsoft.com/office/drawing/2014/chartex" xmlns:cx1="http://schemas.microsoft.com/office/drawing/2015/9/8/chartex" xmlns:cx2="http://schemas.microsoft.com/office/drawing/2015/10/21/chartex" xmlns:cx3="http://schemas.microsoft.com/office/drawing/2016/5/9/chartex" xmlns:cx4="http://schemas.microsoft.com/office/drawing/2016/5/10/chartex" xmlns:cx5="http://schemas.microsoft.com/office/drawing/2016/5/11/chartex" xmlns:cx6="http://schemas.microsoft.com/office/drawing/2016/5/12/chartex" xmlns:cx7="http://schemas.microsoft.com/office/drawing/2016/5/13/chartex" xmlns:cx8="http://schemas.microsoft.com/office/drawing/2016/5/14/chartex" xmlns:mc="http://schemas.openxmlformats.org/markup-compatibility/2006" xmlns:aink="http://schemas.microsoft.com/office/drawing/2016/ink" xmlns:am3d="http://schemas.microsoft.com/office/drawing/2017/model3d" xmlns:o="urn:schemas-microsoft-com:office:office" xmlns:oel="http://schemas.microsoft.com/office/2019/extlst" xmlns:r="http://schemas.openxmlformats.org/officeDocument/2006/relationships" xmlns:m="http://schemas.openxmlformats.org/officeDocument/2006/math" xmlns:v="urn:schemas-microsoft-com:vml" xmlns:wp14="http://schemas.microsoft.com/office/word/2010/wordprocessingDrawing" xmlns:wp="http://schemas.openxmlformats.org/drawingml/2006/wordprocessingDrawing" xmlns:w10="urn:schemas-microsoft-com:office:word" xmlns:w="http://schemas.openxmlformats.org/wordprocessingml/2006/main" xmlns:w14="http://schemas.microsoft.com/office/word/2010/wordml" xmlns:w15="http://schemas.microsoft.com/office/word/2012/wordml" xmlns:w16cex="http://schemas.microsoft.com/office/word/2018/wordml/cex" xmlns:w16cid="http://schemas.microsoft.com/office/word/2016/wordml/cid" xmlns:w16="http://schemas.microsoft.com/office/word/2018/wordml" xmlns:w16du="http://schemas.microsoft.com/office/word/2023/wordml/word16du" xmlns:w16sdtdh="http://schemas.microsoft.com/office/word/2020/wordml/sdtdatahash" xmlns:w16sdtfl="http://schemas.microsoft.com/office/word/2024/wordml/sdtformatlock" xmlns:w16se="http://schemas.microsoft.com/office/word/2015/wordml/symex" xmlns:wpg="http://schemas.microsoft.com/office/word/2010/wordprocessingGroup" xmlns:wpi="http://schemas.microsoft.com/office/word/2010/wordprocessingInk" xmlns:wne="http://schemas.microsoft.com/office/word/2006/wordml" xmlns:wps="http://schemas.microsoft.com/office/word/2010/wordprocessingShape" mc:Ignorable="w14 w15 w16se w16cid w16 w16cex w16sdtdh w16sdtfl w16du wp14">
-  <w:p>
-    <w:pPr>
-      <w:pStyle w:val="Cabealho"/>
-    </w:pPr>
   </w:p>
 </w:hdr>
 </file>
@@ -2364,4 +2278,16 @@
   </a:objectDefaults>
   <a:extraClrSchemeLst/>
 </a:theme>
+</file>
+
+<file path=customXml/item1.xml><?xml version="1.0" encoding="utf-8"?>
+<b:Sources xmlns:b="http://schemas.openxmlformats.org/officeDocument/2006/bibliography" xmlns="http://schemas.openxmlformats.org/officeDocument/2006/bibliography" SelectedStyle="\APASixthEditionOfficeOnline.xsl" StyleName="APA" Version="6"/>
+</file>
+
+<file path=customXml/itemProps1.xml><?xml version="1.0" encoding="utf-8"?>
+<ds:datastoreItem xmlns:ds="http://schemas.openxmlformats.org/officeDocument/2006/customXml" ds:itemID="{154E1C49-C5ED-46EB-833D-143C62804E2A}">
+  <ds:schemaRefs>
+    <ds:schemaRef ds:uri="http://schemas.openxmlformats.org/officeDocument/2006/bibliography"/>
+  </ds:schemaRefs>
+</ds:datastoreItem>
 </file>
</xml_diff>